<commit_message>
Replace assignment document with correct version
</commit_message>
<xml_diff>
--- a/WEEK 1 TO WEEK 6 ASSIGNMENT VERSION 2.docx
+++ b/WEEK 1 TO WEEK 6 ASSIGNMENT VERSION 2.docx
@@ -44,7 +44,7 @@
       <w:sdtPr>
         <w:rPr>
           <w:rFonts w:asciiTheme="minorHAnsi" w:eastAsiaTheme="minorHAnsi" w:hAnsiTheme="minorHAnsi" w:cstheme="minorBidi"/>
-          <w:b w:val="0"/>
+          <w:b/>
           <w:color w:val="auto"/>
           <w:sz w:val="22"/>
           <w:szCs w:val="22"/>
@@ -57,7 +57,7 @@
       </w:sdtPr>
       <w:sdtEndPr>
         <w:rPr>
-          <w:bCs/>
+          <w:b w:val="0"/>
           <w:noProof/>
         </w:rPr>
       </w:sdtEndPr>
@@ -90,13 +90,14 @@
           <w:r>
             <w:fldChar w:fldCharType="separate"/>
           </w:r>
-          <w:hyperlink w:anchor="_Toc232427524" w:history="1">
+          <w:hyperlink w:anchor="_Toc232588253" w:history="1">
             <w:r>
               <w:rPr>
                 <w:rStyle w:val="Hyperlink"/>
-                <w:noProof/>
-              </w:rPr>
-              <w:t>WEEK 4: DATA MANAGEMENT</w:t>
+                <w:rFonts w:ascii="Calibri" w:eastAsia="Times New Roman" w:hAnsi="Calibri" w:cs="Times New Roman"/>
+                <w:noProof/>
+              </w:rPr>
+              <w:t>WEEK 4: EVENT HANDLING AND USER INTERACTION</w:t>
             </w:r>
             <w:r>
               <w:rPr>
@@ -117,7 +118,7 @@
                 <w:noProof/>
                 <w:webHidden/>
               </w:rPr>
-              <w:instrText xml:space="preserve"> PAGEREF _Toc232427524 \h </w:instrText>
+              <w:instrText xml:space="preserve"> PAGEREF _Toc232588253 \h </w:instrText>
             </w:r>
             <w:r>
               <w:rPr>
@@ -159,10 +160,11 @@
               <w:noProof/>
             </w:rPr>
           </w:pPr>
-          <w:hyperlink w:anchor="_Toc232427525" w:history="1">
+          <w:hyperlink w:anchor="_Toc232588254" w:history="1">
             <w:r>
               <w:rPr>
                 <w:rStyle w:val="Hyperlink"/>
+                <w:rFonts w:ascii="Calibri Light" w:eastAsia="Times New Roman" w:hAnsi="Calibri Light" w:cs="Times New Roman"/>
                 <w:noProof/>
               </w:rPr>
               <w:t>PRACTICAL EXERCISE DONE</w:t>
@@ -186,7 +188,7 @@
                 <w:noProof/>
                 <w:webHidden/>
               </w:rPr>
-              <w:instrText xml:space="preserve"> PAGEREF _Toc232427525 \h </w:instrText>
+              <w:instrText xml:space="preserve"> PAGEREF _Toc232588254 \h </w:instrText>
             </w:r>
             <w:r>
               <w:rPr>
@@ -228,10 +230,11 @@
               <w:noProof/>
             </w:rPr>
           </w:pPr>
-          <w:hyperlink w:anchor="_Toc232427526" w:history="1">
+          <w:hyperlink w:anchor="_Toc232588255" w:history="1">
             <w:r>
               <w:rPr>
                 <w:rStyle w:val="Hyperlink"/>
+                <w:rFonts w:ascii="Calibri Light" w:eastAsia="Times New Roman" w:hAnsi="Calibri Light" w:cs="Times New Roman"/>
                 <w:noProof/>
               </w:rPr>
               <w:t>TOOLS/SOFTWARES USED</w:t>
@@ -255,7 +258,7 @@
                 <w:noProof/>
                 <w:webHidden/>
               </w:rPr>
-              <w:instrText xml:space="preserve"> PAGEREF _Toc232427526 \h </w:instrText>
+              <w:instrText xml:space="preserve"> PAGEREF _Toc232588255 \h </w:instrText>
             </w:r>
             <w:r>
               <w:rPr>
@@ -275,7 +278,7 @@
                 <w:noProof/>
                 <w:webHidden/>
               </w:rPr>
-              <w:t>6</w:t>
+              <w:t>5</w:t>
             </w:r>
             <w:r>
               <w:rPr>
@@ -297,10 +300,11 @@
               <w:noProof/>
             </w:rPr>
           </w:pPr>
-          <w:hyperlink w:anchor="_Toc232427527" w:history="1">
+          <w:hyperlink w:anchor="_Toc232588256" w:history="1">
             <w:r>
               <w:rPr>
                 <w:rStyle w:val="Hyperlink"/>
+                <w:rFonts w:ascii="Calibri Light" w:eastAsia="Times New Roman" w:hAnsi="Calibri Light" w:cs="Times New Roman"/>
                 <w:noProof/>
               </w:rPr>
               <w:t>PERSONNAL REFLECTION</w:t>
@@ -324,7 +328,7 @@
                 <w:noProof/>
                 <w:webHidden/>
               </w:rPr>
-              <w:instrText xml:space="preserve"> PAGEREF _Toc232427527 \h </w:instrText>
+              <w:instrText xml:space="preserve"> PAGEREF _Toc232588256 \h </w:instrText>
             </w:r>
             <w:r>
               <w:rPr>
@@ -344,7 +348,7 @@
                 <w:noProof/>
                 <w:webHidden/>
               </w:rPr>
-              <w:t>6</w:t>
+              <w:t>5</w:t>
             </w:r>
             <w:r>
               <w:rPr>
@@ -366,13 +370,14 @@
               <w:noProof/>
             </w:rPr>
           </w:pPr>
-          <w:hyperlink w:anchor="_Toc232427528" w:history="1">
+          <w:hyperlink w:anchor="_Toc232588257" w:history="1">
             <w:r>
               <w:rPr>
                 <w:rStyle w:val="Hyperlink"/>
-                <w:noProof/>
-              </w:rPr>
-              <w:t>WEEK 5: NETWORKING</w:t>
+                <w:rFonts w:ascii="Calibri" w:eastAsia="Times New Roman" w:hAnsi="Calibri" w:cs="Times New Roman"/>
+                <w:noProof/>
+              </w:rPr>
+              <w:t>WEEK 5: DATA MANAGEMENT</w:t>
             </w:r>
             <w:r>
               <w:rPr>
@@ -393,7 +398,7 @@
                 <w:noProof/>
                 <w:webHidden/>
               </w:rPr>
-              <w:instrText xml:space="preserve"> PAGEREF _Toc232427528 \h </w:instrText>
+              <w:instrText xml:space="preserve"> PAGEREF _Toc232588257 \h </w:instrText>
             </w:r>
             <w:r>
               <w:rPr>
@@ -413,7 +418,7 @@
                 <w:noProof/>
                 <w:webHidden/>
               </w:rPr>
-              <w:t>6</w:t>
+              <w:t>5</w:t>
             </w:r>
             <w:r>
               <w:rPr>
@@ -435,13 +440,14 @@
               <w:noProof/>
             </w:rPr>
           </w:pPr>
-          <w:hyperlink w:anchor="_Toc232427529" w:history="1">
+          <w:hyperlink w:anchor="_Toc232588258" w:history="1">
             <w:r>
               <w:rPr>
                 <w:rStyle w:val="Hyperlink"/>
-                <w:noProof/>
-              </w:rPr>
-              <w:t>PRACTICAL ACTIVITIES UNDERTAKEN</w:t>
+                <w:rFonts w:ascii="Calibri Light" w:eastAsia="Times New Roman" w:hAnsi="Calibri Light" w:cs="Times New Roman"/>
+                <w:noProof/>
+              </w:rPr>
+              <w:t>PRACTICAL EXERCISE DONE</w:t>
             </w:r>
             <w:r>
               <w:rPr>
@@ -462,7 +468,7 @@
                 <w:noProof/>
                 <w:webHidden/>
               </w:rPr>
-              <w:instrText xml:space="preserve"> PAGEREF _Toc232427529 \h </w:instrText>
+              <w:instrText xml:space="preserve"> PAGEREF _Toc232588258 \h </w:instrText>
             </w:r>
             <w:r>
               <w:rPr>
@@ -482,7 +488,7 @@
                 <w:noProof/>
                 <w:webHidden/>
               </w:rPr>
-              <w:t>6</w:t>
+              <w:t>5</w:t>
             </w:r>
             <w:r>
               <w:rPr>
@@ -504,13 +510,14 @@
               <w:noProof/>
             </w:rPr>
           </w:pPr>
-          <w:hyperlink w:anchor="_Toc232427530" w:history="1">
+          <w:hyperlink w:anchor="_Toc232588259" w:history="1">
             <w:r>
               <w:rPr>
                 <w:rStyle w:val="Hyperlink"/>
-                <w:noProof/>
-              </w:rPr>
-              <w:t>TOOLS/SOFTWARE USED</w:t>
+                <w:rFonts w:ascii="Calibri Light" w:eastAsia="Times New Roman" w:hAnsi="Calibri Light" w:cs="Times New Roman"/>
+                <w:noProof/>
+              </w:rPr>
+              <w:t>TOOLS/SOFTWARES USED</w:t>
             </w:r>
             <w:r>
               <w:rPr>
@@ -531,7 +538,7 @@
                 <w:noProof/>
                 <w:webHidden/>
               </w:rPr>
-              <w:instrText xml:space="preserve"> PAGEREF _Toc232427530 \h </w:instrText>
+              <w:instrText xml:space="preserve"> PAGEREF _Toc232588259 \h </w:instrText>
             </w:r>
             <w:r>
               <w:rPr>
@@ -573,10 +580,11 @@
               <w:noProof/>
             </w:rPr>
           </w:pPr>
-          <w:hyperlink w:anchor="_Toc232427531" w:history="1">
+          <w:hyperlink w:anchor="_Toc232588260" w:history="1">
             <w:r>
               <w:rPr>
                 <w:rStyle w:val="Hyperlink"/>
+                <w:rFonts w:ascii="Calibri Light" w:eastAsia="Times New Roman" w:hAnsi="Calibri Light" w:cs="Times New Roman"/>
                 <w:noProof/>
               </w:rPr>
               <w:t>PERSONNAL REFLECTION</w:t>
@@ -600,7 +608,7 @@
                 <w:noProof/>
                 <w:webHidden/>
               </w:rPr>
-              <w:instrText xml:space="preserve"> PAGEREF _Toc232427531 \h </w:instrText>
+              <w:instrText xml:space="preserve"> PAGEREF _Toc232588260 \h </w:instrText>
             </w:r>
             <w:r>
               <w:rPr>
@@ -642,10 +650,293 @@
               <w:noProof/>
             </w:rPr>
           </w:pPr>
-          <w:hyperlink w:anchor="_Toc232427532" w:history="1">
+          <w:hyperlink w:anchor="_Toc232588261" w:history="1">
             <w:r>
               <w:rPr>
                 <w:rStyle w:val="Hyperlink"/>
+                <w:rFonts w:ascii="Calibri" w:eastAsia="Times New Roman" w:hAnsi="Calibri" w:cs="Times New Roman"/>
+                <w:b/>
+                <w:noProof/>
+              </w:rPr>
+              <w:t>WEEK 6: NETWORKING AND API</w:t>
+            </w:r>
+            <w:r>
+              <w:rPr>
+                <w:noProof/>
+                <w:webHidden/>
+              </w:rPr>
+              <w:tab/>
+            </w:r>
+            <w:r>
+              <w:rPr>
+                <w:noProof/>
+                <w:webHidden/>
+              </w:rPr>
+              <w:fldChar w:fldCharType="begin"/>
+            </w:r>
+            <w:r>
+              <w:rPr>
+                <w:noProof/>
+                <w:webHidden/>
+              </w:rPr>
+              <w:instrText xml:space="preserve"> PAGEREF _Toc232588261 \h </w:instrText>
+            </w:r>
+            <w:r>
+              <w:rPr>
+                <w:noProof/>
+                <w:webHidden/>
+              </w:rPr>
+            </w:r>
+            <w:r>
+              <w:rPr>
+                <w:noProof/>
+                <w:webHidden/>
+              </w:rPr>
+              <w:fldChar w:fldCharType="separate"/>
+            </w:r>
+            <w:r>
+              <w:rPr>
+                <w:noProof/>
+                <w:webHidden/>
+              </w:rPr>
+              <w:t>9</w:t>
+            </w:r>
+            <w:r>
+              <w:rPr>
+                <w:noProof/>
+                <w:webHidden/>
+              </w:rPr>
+              <w:fldChar w:fldCharType="end"/>
+            </w:r>
+          </w:hyperlink>
+        </w:p>
+        <w:p>
+          <w:pPr>
+            <w:pStyle w:val="TOC2"/>
+            <w:tabs>
+              <w:tab w:val="right" w:leader="dot" w:pos="9350"/>
+            </w:tabs>
+            <w:rPr>
+              <w:rFonts w:eastAsiaTheme="minorEastAsia"/>
+              <w:noProof/>
+            </w:rPr>
+          </w:pPr>
+          <w:hyperlink w:anchor="_Toc232588262" w:history="1">
+            <w:r>
+              <w:rPr>
+                <w:rStyle w:val="Hyperlink"/>
+                <w:rFonts w:ascii="Calibri Light" w:eastAsia="Times New Roman" w:hAnsi="Calibri Light" w:cs="Times New Roman"/>
+                <w:noProof/>
+              </w:rPr>
+              <w:t>PRACTICAL ACTIVITIES UNDERTAKEN</w:t>
+            </w:r>
+            <w:r>
+              <w:rPr>
+                <w:noProof/>
+                <w:webHidden/>
+              </w:rPr>
+              <w:tab/>
+            </w:r>
+            <w:r>
+              <w:rPr>
+                <w:noProof/>
+                <w:webHidden/>
+              </w:rPr>
+              <w:fldChar w:fldCharType="begin"/>
+            </w:r>
+            <w:r>
+              <w:rPr>
+                <w:noProof/>
+                <w:webHidden/>
+              </w:rPr>
+              <w:instrText xml:space="preserve"> PAGEREF _Toc232588262 \h </w:instrText>
+            </w:r>
+            <w:r>
+              <w:rPr>
+                <w:noProof/>
+                <w:webHidden/>
+              </w:rPr>
+            </w:r>
+            <w:r>
+              <w:rPr>
+                <w:noProof/>
+                <w:webHidden/>
+              </w:rPr>
+              <w:fldChar w:fldCharType="separate"/>
+            </w:r>
+            <w:r>
+              <w:rPr>
+                <w:noProof/>
+                <w:webHidden/>
+              </w:rPr>
+              <w:t>9</w:t>
+            </w:r>
+            <w:r>
+              <w:rPr>
+                <w:noProof/>
+                <w:webHidden/>
+              </w:rPr>
+              <w:fldChar w:fldCharType="end"/>
+            </w:r>
+          </w:hyperlink>
+        </w:p>
+        <w:p>
+          <w:pPr>
+            <w:pStyle w:val="TOC2"/>
+            <w:tabs>
+              <w:tab w:val="right" w:leader="dot" w:pos="9350"/>
+            </w:tabs>
+            <w:rPr>
+              <w:rFonts w:eastAsiaTheme="minorEastAsia"/>
+              <w:noProof/>
+            </w:rPr>
+          </w:pPr>
+          <w:hyperlink w:anchor="_Toc232588263" w:history="1">
+            <w:r>
+              <w:rPr>
+                <w:rStyle w:val="Hyperlink"/>
+                <w:rFonts w:ascii="Calibri Light" w:eastAsia="Times New Roman" w:hAnsi="Calibri Light" w:cs="Times New Roman"/>
+                <w:noProof/>
+              </w:rPr>
+              <w:t>TOOLS/SOFTWARE USED</w:t>
+            </w:r>
+            <w:r>
+              <w:rPr>
+                <w:noProof/>
+                <w:webHidden/>
+              </w:rPr>
+              <w:tab/>
+            </w:r>
+            <w:r>
+              <w:rPr>
+                <w:noProof/>
+                <w:webHidden/>
+              </w:rPr>
+              <w:fldChar w:fldCharType="begin"/>
+            </w:r>
+            <w:r>
+              <w:rPr>
+                <w:noProof/>
+                <w:webHidden/>
+              </w:rPr>
+              <w:instrText xml:space="preserve"> PAGEREF _Toc232588263 \h </w:instrText>
+            </w:r>
+            <w:r>
+              <w:rPr>
+                <w:noProof/>
+                <w:webHidden/>
+              </w:rPr>
+            </w:r>
+            <w:r>
+              <w:rPr>
+                <w:noProof/>
+                <w:webHidden/>
+              </w:rPr>
+              <w:fldChar w:fldCharType="separate"/>
+            </w:r>
+            <w:r>
+              <w:rPr>
+                <w:noProof/>
+                <w:webHidden/>
+              </w:rPr>
+              <w:t>12</w:t>
+            </w:r>
+            <w:r>
+              <w:rPr>
+                <w:noProof/>
+                <w:webHidden/>
+              </w:rPr>
+              <w:fldChar w:fldCharType="end"/>
+            </w:r>
+          </w:hyperlink>
+        </w:p>
+        <w:p>
+          <w:pPr>
+            <w:pStyle w:val="TOC2"/>
+            <w:tabs>
+              <w:tab w:val="right" w:leader="dot" w:pos="9350"/>
+            </w:tabs>
+            <w:rPr>
+              <w:rFonts w:eastAsiaTheme="minorEastAsia"/>
+              <w:noProof/>
+            </w:rPr>
+          </w:pPr>
+          <w:hyperlink w:anchor="_Toc232588264" w:history="1">
+            <w:r>
+              <w:rPr>
+                <w:rStyle w:val="Hyperlink"/>
+                <w:rFonts w:ascii="Calibri Light" w:eastAsia="Times New Roman" w:hAnsi="Calibri Light" w:cs="Times New Roman"/>
+                <w:noProof/>
+              </w:rPr>
+              <w:t>PERSONNAL REFLECTION</w:t>
+            </w:r>
+            <w:r>
+              <w:rPr>
+                <w:noProof/>
+                <w:webHidden/>
+              </w:rPr>
+              <w:tab/>
+            </w:r>
+            <w:r>
+              <w:rPr>
+                <w:noProof/>
+                <w:webHidden/>
+              </w:rPr>
+              <w:fldChar w:fldCharType="begin"/>
+            </w:r>
+            <w:r>
+              <w:rPr>
+                <w:noProof/>
+                <w:webHidden/>
+              </w:rPr>
+              <w:instrText xml:space="preserve"> PAGEREF _Toc232588264 \h </w:instrText>
+            </w:r>
+            <w:r>
+              <w:rPr>
+                <w:noProof/>
+                <w:webHidden/>
+              </w:rPr>
+            </w:r>
+            <w:r>
+              <w:rPr>
+                <w:noProof/>
+                <w:webHidden/>
+              </w:rPr>
+              <w:fldChar w:fldCharType="separate"/>
+            </w:r>
+            <w:r>
+              <w:rPr>
+                <w:noProof/>
+                <w:webHidden/>
+              </w:rPr>
+              <w:t>12</w:t>
+            </w:r>
+            <w:r>
+              <w:rPr>
+                <w:noProof/>
+                <w:webHidden/>
+              </w:rPr>
+              <w:fldChar w:fldCharType="end"/>
+            </w:r>
+          </w:hyperlink>
+        </w:p>
+        <w:p>
+          <w:pPr>
+            <w:pStyle w:val="TOC1"/>
+            <w:tabs>
+              <w:tab w:val="right" w:leader="dot" w:pos="9350"/>
+            </w:tabs>
+            <w:rPr>
+              <w:rFonts w:eastAsiaTheme="minorEastAsia"/>
+              <w:noProof/>
+            </w:rPr>
+          </w:pPr>
+          <w:hyperlink w:anchor="_Toc232588265" w:history="1">
+            <w:r>
+              <w:rPr>
+                <w:rStyle w:val="Hyperlink"/>
+                <w:rFonts w:ascii="Calibri" w:eastAsia="Times New Roman" w:hAnsi="Calibri" w:cs="Times New Roman"/>
+                <w:b/>
                 <w:noProof/>
               </w:rPr>
               <w:t>REPORT</w:t>
@@ -669,7 +960,7 @@
                 <w:noProof/>
                 <w:webHidden/>
               </w:rPr>
-              <w:instrText xml:space="preserve"> PAGEREF _Toc232427532 \h </w:instrText>
+              <w:instrText xml:space="preserve"> PAGEREF _Toc232588265 \h </w:instrText>
             </w:r>
             <w:r>
               <w:rPr>
@@ -689,7 +980,7 @@
                 <w:noProof/>
                 <w:webHidden/>
               </w:rPr>
-              <w:t>9</w:t>
+              <w:t>12</w:t>
             </w:r>
             <w:r>
               <w:rPr>
@@ -743,39 +1034,96 @@
     </w:p>
     <w:p>
       <w:pPr>
-        <w:pStyle w:val="Heading1"/>
-        <w:rPr>
-          <w:b w:val="0"/>
-        </w:rPr>
-      </w:pPr>
-      <w:bookmarkStart w:id="0" w:name="_Toc232427524"/>
-      <w:r>
-        <w:rPr>
-          <w:b w:val="0"/>
-        </w:rPr>
-        <w:t>WEEK 4: DATA MANAGEMENT</w:t>
+        <w:keepNext/>
+        <w:keepLines/>
+        <w:spacing w:before="240" w:after="0"/>
+        <w:outlineLvl w:val="0"/>
+        <w:rPr>
+          <w:rFonts w:ascii="Calibri" w:eastAsia="Times New Roman" w:hAnsi="Calibri" w:cs="Times New Roman"/>
+          <w:color w:val="2F5496"/>
+          <w:sz w:val="36"/>
+          <w:szCs w:val="32"/>
+        </w:rPr>
+      </w:pPr>
+      <w:bookmarkStart w:id="0" w:name="_Toc232587854"/>
+      <w:bookmarkStart w:id="1" w:name="_Toc232588253"/>
+      <w:r>
+        <w:rPr>
+          <w:rFonts w:ascii="Calibri" w:eastAsia="Times New Roman" w:hAnsi="Calibri" w:cs="Times New Roman"/>
+          <w:color w:val="2F5496"/>
+          <w:sz w:val="36"/>
+          <w:szCs w:val="32"/>
+        </w:rPr>
+        <w:t xml:space="preserve">WEEK </w:t>
+      </w:r>
+      <w:r>
+        <w:rPr>
+          <w:rFonts w:ascii="Calibri" w:eastAsia="Times New Roman" w:hAnsi="Calibri" w:cs="Times New Roman"/>
+          <w:color w:val="2F5496"/>
+          <w:sz w:val="36"/>
+          <w:szCs w:val="32"/>
+        </w:rPr>
+        <w:t>4</w:t>
+      </w:r>
+      <w:r>
+        <w:rPr>
+          <w:rFonts w:ascii="Calibri" w:eastAsia="Times New Roman" w:hAnsi="Calibri" w:cs="Times New Roman"/>
+          <w:color w:val="2F5496"/>
+          <w:sz w:val="36"/>
+          <w:szCs w:val="32"/>
+        </w:rPr>
+        <w:t xml:space="preserve">: </w:t>
+      </w:r>
+      <w:r>
+        <w:rPr>
+          <w:rFonts w:ascii="Calibri" w:eastAsia="Times New Roman" w:hAnsi="Calibri" w:cs="Times New Roman"/>
+          <w:color w:val="2F5496"/>
+          <w:sz w:val="36"/>
+          <w:szCs w:val="32"/>
+        </w:rPr>
+        <w:t>EVENT HANDLING AND USER INTERACTION</w:t>
       </w:r>
       <w:bookmarkEnd w:id="0"/>
-    </w:p>
-    <w:p>
-      <w:pPr>
-        <w:pStyle w:val="Heading2"/>
-      </w:pPr>
-      <w:bookmarkStart w:id="1" w:name="_Toc232427525"/>
-      <w:r>
+      <w:bookmarkEnd w:id="1"/>
+    </w:p>
+    <w:p>
+      <w:pPr>
+        <w:keepNext/>
+        <w:keepLines/>
+        <w:spacing w:before="40" w:after="0"/>
+        <w:outlineLvl w:val="1"/>
+        <w:rPr>
+          <w:rFonts w:ascii="Calibri Light" w:eastAsia="Times New Roman" w:hAnsi="Calibri Light" w:cs="Times New Roman"/>
+          <w:color w:val="2F5496"/>
+          <w:sz w:val="26"/>
+          <w:szCs w:val="26"/>
+        </w:rPr>
+      </w:pPr>
+      <w:bookmarkStart w:id="2" w:name="_Toc232587855"/>
+      <w:bookmarkStart w:id="3" w:name="_Toc232588254"/>
+      <w:r>
+        <w:rPr>
+          <w:rFonts w:ascii="Calibri Light" w:eastAsia="Times New Roman" w:hAnsi="Calibri Light" w:cs="Times New Roman"/>
+          <w:color w:val="2F5496"/>
+          <w:sz w:val="26"/>
+          <w:szCs w:val="26"/>
+        </w:rPr>
         <w:t>PRACTICAL EXERCISE DONE</w:t>
       </w:r>
-      <w:bookmarkEnd w:id="1"/>
-    </w:p>
-    <w:p>
-      <w:pPr>
-        <w:rPr>
+      <w:bookmarkEnd w:id="2"/>
+      <w:bookmarkEnd w:id="3"/>
+    </w:p>
+    <w:p>
+      <w:pPr>
+        <w:rPr>
+          <w:rFonts w:ascii="Calibri" w:eastAsia="Calibri" w:hAnsi="Calibri" w:cs="Times New Roman"/>
           <w:sz w:val="24"/>
           <w:szCs w:val="24"/>
         </w:rPr>
       </w:pPr>
       <w:r>
         <w:rPr>
+          <w:rFonts w:ascii="Calibri" w:eastAsia="Calibri" w:hAnsi="Calibri" w:cs="Times New Roman"/>
           <w:sz w:val="24"/>
           <w:szCs w:val="24"/>
         </w:rPr>
@@ -785,26 +1133,33 @@
     <w:p>
       <w:pPr>
         <w:rPr>
-          <w:rStyle w:val="IntenseEmphasis"/>
-        </w:rPr>
-      </w:pPr>
-      <w:r>
-        <w:rPr>
-          <w:rStyle w:val="IntenseEmphasis"/>
+          <w:rFonts w:ascii="Calibri" w:eastAsia="Calibri" w:hAnsi="Calibri" w:cs="Times New Roman"/>
+          <w:i/>
+          <w:iCs/>
+          <w:color w:val="4472C4"/>
+        </w:rPr>
+      </w:pPr>
+      <w:r>
+        <w:rPr>
+          <w:rFonts w:ascii="Calibri" w:eastAsia="Calibri" w:hAnsi="Calibri" w:cs="Times New Roman"/>
+          <w:i/>
+          <w:iCs/>
+          <w:color w:val="4472C4"/>
         </w:rPr>
         <w:t>Student registry APP screenshots</w:t>
       </w:r>
       <w:r>
         <w:rPr>
+          <w:rFonts w:ascii="Calibri" w:eastAsia="Calibri" w:hAnsi="Calibri" w:cs="Times New Roman"/>
           <w:noProof/>
           <w:sz w:val="24"/>
           <w:szCs w:val="24"/>
         </w:rPr>
         <w:drawing>
-          <wp:inline distT="0" distB="0" distL="0" distR="0" wp14:anchorId="6C41113B" wp14:editId="01F663A0">
+          <wp:inline distT="0" distB="0" distL="0" distR="0" wp14:anchorId="4F6FAF14" wp14:editId="0A9C8210">
             <wp:extent cx="5943600" cy="3168650"/>
             <wp:effectExtent l="0" t="0" r="0" b="0"/>
-            <wp:docPr id="2" name="Picture 2"/>
+            <wp:docPr id="36" name="Picture 36"/>
             <wp:cNvGraphicFramePr>
               <a:graphicFrameLocks xmlns:a="http://schemas.openxmlformats.org/drawingml/2006/main" noChangeAspect="1"/>
             </wp:cNvGraphicFramePr>
@@ -842,18 +1197,425 @@
           </wp:inline>
         </w:drawing>
       </w:r>
-      <w:r>
-        <w:rPr>
+    </w:p>
+    <w:p>
+      <w:pPr>
+        <w:rPr>
+          <w:rFonts w:ascii="Calibri" w:eastAsia="Calibri" w:hAnsi="Calibri" w:cs="Times New Roman"/>
+          <w:i/>
+          <w:iCs/>
+          <w:color w:val="4472C4"/>
+        </w:rPr>
+      </w:pPr>
+      <w:r>
+        <w:rPr>
+          <w:rFonts w:ascii="Calibri" w:eastAsia="Calibri" w:hAnsi="Calibri" w:cs="Times New Roman"/>
           <w:noProof/>
           <w:sz w:val="24"/>
           <w:szCs w:val="24"/>
         </w:rPr>
         <w:lastRenderedPageBreak/>
         <w:drawing>
-          <wp:inline distT="0" distB="0" distL="0" distR="0" wp14:anchorId="28C5EB7C" wp14:editId="3A391C64">
+          <wp:inline distT="0" distB="0" distL="0" distR="0" wp14:anchorId="31365397" wp14:editId="0C318F0A">
+            <wp:extent cx="4221480" cy="8229600"/>
+            <wp:effectExtent l="0" t="0" r="7620" b="0"/>
+            <wp:docPr id="39" name="Picture 39"/>
+            <wp:cNvGraphicFramePr>
+              <a:graphicFrameLocks xmlns:a="http://schemas.openxmlformats.org/drawingml/2006/main" noChangeAspect="1"/>
+            </wp:cNvGraphicFramePr>
+            <a:graphic xmlns:a="http://schemas.openxmlformats.org/drawingml/2006/main">
+              <a:graphicData uri="http://schemas.openxmlformats.org/drawingml/2006/picture">
+                <pic:pic xmlns:pic="http://schemas.openxmlformats.org/drawingml/2006/picture">
+                  <pic:nvPicPr>
+                    <pic:cNvPr id="8" name="Picture 8"/>
+                    <pic:cNvPicPr/>
+                  </pic:nvPicPr>
+                  <pic:blipFill>
+                    <a:blip r:embed="rId7">
+                      <a:extLst>
+                        <a:ext uri="{28A0092B-C50C-407E-A947-70E740481C1C}">
+                          <a14:useLocalDpi xmlns:a14="http://schemas.microsoft.com/office/drawing/2010/main" val="0"/>
+                        </a:ext>
+                      </a:extLst>
+                    </a:blip>
+                    <a:stretch>
+                      <a:fillRect/>
+                    </a:stretch>
+                  </pic:blipFill>
+                  <pic:spPr>
+                    <a:xfrm>
+                      <a:off x="0" y="0"/>
+                      <a:ext cx="4221480" cy="8229600"/>
+                    </a:xfrm>
+                    <a:prstGeom prst="rect">
+                      <a:avLst/>
+                    </a:prstGeom>
+                  </pic:spPr>
+                </pic:pic>
+              </a:graphicData>
+            </a:graphic>
+          </wp:inline>
+        </w:drawing>
+      </w:r>
+    </w:p>
+    <w:p>
+      <w:pPr>
+        <w:rPr>
+          <w:rFonts w:ascii="Calibri" w:eastAsia="Calibri" w:hAnsi="Calibri" w:cs="Times New Roman"/>
+          <w:i/>
+          <w:iCs/>
+          <w:color w:val="4472C4"/>
+        </w:rPr>
+      </w:pPr>
+      <w:r>
+        <w:rPr>
+          <w:rFonts w:ascii="Calibri" w:eastAsia="Calibri" w:hAnsi="Calibri" w:cs="Times New Roman"/>
+          <w:i/>
+          <w:iCs/>
+          <w:noProof/>
+          <w:color w:val="4472C4"/>
+        </w:rPr>
+        <w:lastRenderedPageBreak/>
+        <w:drawing>
+          <wp:inline distT="0" distB="0" distL="0" distR="0" wp14:anchorId="64493B89" wp14:editId="687DECDB">
+            <wp:extent cx="4206240" cy="8229600"/>
+            <wp:effectExtent l="0" t="0" r="3810" b="0"/>
+            <wp:docPr id="33" name="Picture 33"/>
+            <wp:cNvGraphicFramePr>
+              <a:graphicFrameLocks xmlns:a="http://schemas.openxmlformats.org/drawingml/2006/main" noChangeAspect="1"/>
+            </wp:cNvGraphicFramePr>
+            <a:graphic xmlns:a="http://schemas.openxmlformats.org/drawingml/2006/main">
+              <a:graphicData uri="http://schemas.openxmlformats.org/drawingml/2006/picture">
+                <pic:pic xmlns:pic="http://schemas.openxmlformats.org/drawingml/2006/picture">
+                  <pic:nvPicPr>
+                    <pic:cNvPr id="33" name="Picture 33"/>
+                    <pic:cNvPicPr/>
+                  </pic:nvPicPr>
+                  <pic:blipFill>
+                    <a:blip r:embed="rId8"/>
+                    <a:stretch>
+                      <a:fillRect/>
+                    </a:stretch>
+                  </pic:blipFill>
+                  <pic:spPr>
+                    <a:xfrm>
+                      <a:off x="0" y="0"/>
+                      <a:ext cx="4206240" cy="8229600"/>
+                    </a:xfrm>
+                    <a:prstGeom prst="rect">
+                      <a:avLst/>
+                    </a:prstGeom>
+                  </pic:spPr>
+                </pic:pic>
+              </a:graphicData>
+            </a:graphic>
+          </wp:inline>
+        </w:drawing>
+      </w:r>
+    </w:p>
+    <w:p>
+      <w:pPr>
+        <w:keepNext/>
+        <w:keepLines/>
+        <w:spacing w:before="40" w:after="0"/>
+        <w:outlineLvl w:val="1"/>
+        <w:rPr>
+          <w:rFonts w:ascii="Calibri Light" w:eastAsia="Times New Roman" w:hAnsi="Calibri Light" w:cs="Times New Roman"/>
+          <w:color w:val="2F5496"/>
+          <w:sz w:val="26"/>
+          <w:szCs w:val="26"/>
+        </w:rPr>
+      </w:pPr>
+      <w:bookmarkStart w:id="4" w:name="_Toc232587856"/>
+      <w:bookmarkStart w:id="5" w:name="_Toc232588255"/>
+      <w:r>
+        <w:rPr>
+          <w:rFonts w:ascii="Calibri Light" w:eastAsia="Times New Roman" w:hAnsi="Calibri Light" w:cs="Times New Roman"/>
+          <w:color w:val="2F5496"/>
+          <w:sz w:val="26"/>
+          <w:szCs w:val="26"/>
+        </w:rPr>
+        <w:lastRenderedPageBreak/>
+        <w:t>TOOLS/SOFTWARES USED</w:t>
+      </w:r>
+      <w:bookmarkEnd w:id="4"/>
+      <w:bookmarkEnd w:id="5"/>
+    </w:p>
+    <w:p>
+      <w:pPr>
+        <w:numPr>
+          <w:ilvl w:val="0"/>
+          <w:numId w:val="4"/>
+        </w:numPr>
+        <w:contextualSpacing/>
+        <w:rPr>
+          <w:rFonts w:ascii="Calibri" w:eastAsia="Calibri" w:hAnsi="Calibri" w:cs="Times New Roman"/>
+        </w:rPr>
+      </w:pPr>
+      <w:r>
+        <w:rPr>
+          <w:rFonts w:ascii="Calibri" w:eastAsia="Calibri" w:hAnsi="Calibri" w:cs="Times New Roman"/>
+        </w:rPr>
+        <w:t>Flutter</w:t>
+      </w:r>
+    </w:p>
+    <w:p>
+      <w:pPr>
+        <w:numPr>
+          <w:ilvl w:val="0"/>
+          <w:numId w:val="4"/>
+        </w:numPr>
+        <w:contextualSpacing/>
+        <w:rPr>
+          <w:rFonts w:ascii="Calibri" w:eastAsia="Calibri" w:hAnsi="Calibri" w:cs="Times New Roman"/>
+        </w:rPr>
+      </w:pPr>
+      <w:r>
+        <w:rPr>
+          <w:rFonts w:ascii="Calibri" w:eastAsia="Calibri" w:hAnsi="Calibri" w:cs="Times New Roman"/>
+        </w:rPr>
+        <w:t>Vs code</w:t>
+      </w:r>
+    </w:p>
+    <w:p>
+      <w:pPr>
+        <w:numPr>
+          <w:ilvl w:val="0"/>
+          <w:numId w:val="4"/>
+        </w:numPr>
+        <w:contextualSpacing/>
+        <w:rPr>
+          <w:rFonts w:ascii="Calibri" w:eastAsia="Calibri" w:hAnsi="Calibri" w:cs="Times New Roman"/>
+        </w:rPr>
+      </w:pPr>
+      <w:r>
+        <w:rPr>
+          <w:rFonts w:ascii="Calibri" w:eastAsia="Calibri" w:hAnsi="Calibri" w:cs="Times New Roman"/>
+        </w:rPr>
+        <w:t>Android Studio</w:t>
+      </w:r>
+    </w:p>
+    <w:p>
+      <w:pPr>
+        <w:keepNext/>
+        <w:keepLines/>
+        <w:spacing w:before="40" w:after="0"/>
+        <w:outlineLvl w:val="1"/>
+        <w:rPr>
+          <w:rFonts w:ascii="Calibri Light" w:eastAsia="Times New Roman" w:hAnsi="Calibri Light" w:cs="Times New Roman"/>
+          <w:color w:val="2F5496"/>
+          <w:sz w:val="26"/>
+          <w:szCs w:val="26"/>
+        </w:rPr>
+      </w:pPr>
+      <w:bookmarkStart w:id="6" w:name="_Toc232587857"/>
+      <w:bookmarkStart w:id="7" w:name="_Toc232588256"/>
+      <w:r>
+        <w:rPr>
+          <w:rFonts w:ascii="Calibri Light" w:eastAsia="Times New Roman" w:hAnsi="Calibri Light" w:cs="Times New Roman"/>
+          <w:color w:val="2F5496"/>
+          <w:sz w:val="26"/>
+          <w:szCs w:val="26"/>
+        </w:rPr>
+        <w:t>PERSONNAL REFLECTION</w:t>
+      </w:r>
+      <w:bookmarkEnd w:id="6"/>
+      <w:bookmarkEnd w:id="7"/>
+    </w:p>
+    <w:p>
+      <w:pPr>
+        <w:rPr>
+          <w:rFonts w:ascii="Calibri" w:eastAsia="Calibri" w:hAnsi="Calibri" w:cs="Times New Roman"/>
+        </w:rPr>
+      </w:pPr>
+      <w:r>
+        <w:rPr>
+          <w:rFonts w:ascii="Calibri" w:eastAsia="Calibri" w:hAnsi="Calibri" w:cs="Times New Roman"/>
+        </w:rPr>
+        <w:t>Working on the Student Record Management App helped me understand the importance of local storage and database management in mobile applications</w:t>
+      </w:r>
+      <w:r>
+        <w:rPr>
+          <w:rFonts w:ascii="Calibri" w:eastAsia="Calibri" w:hAnsi="Calibri" w:cs="Times New Roman"/>
+        </w:rPr>
+        <w:t xml:space="preserve">. </w:t>
+      </w:r>
+      <w:r>
+        <w:rPr>
+          <w:rFonts w:ascii="Calibri" w:eastAsia="Calibri" w:hAnsi="Calibri" w:cs="Times New Roman"/>
+        </w:rPr>
+        <w:t>I also learned how primary keys ensure data integrity and how SQLite efficiently manages structured data locally.</w:t>
+      </w:r>
+    </w:p>
+    <w:p>
+      <w:pPr>
+        <w:keepNext/>
+        <w:keepLines/>
+        <w:spacing w:before="240" w:after="0"/>
+        <w:outlineLvl w:val="0"/>
+        <w:rPr>
+          <w:rFonts w:ascii="Calibri" w:eastAsia="Times New Roman" w:hAnsi="Calibri" w:cs="Times New Roman"/>
+          <w:color w:val="2F5496"/>
+          <w:sz w:val="36"/>
+          <w:szCs w:val="32"/>
+        </w:rPr>
+      </w:pPr>
+      <w:bookmarkStart w:id="8" w:name="_Toc232587858"/>
+      <w:bookmarkStart w:id="9" w:name="_Toc232588257"/>
+      <w:r>
+        <w:rPr>
+          <w:rFonts w:ascii="Calibri" w:eastAsia="Times New Roman" w:hAnsi="Calibri" w:cs="Times New Roman"/>
+          <w:color w:val="2F5496"/>
+          <w:sz w:val="36"/>
+          <w:szCs w:val="32"/>
+        </w:rPr>
+        <w:t xml:space="preserve">WEEK </w:t>
+      </w:r>
+      <w:r>
+        <w:rPr>
+          <w:rFonts w:ascii="Calibri" w:eastAsia="Times New Roman" w:hAnsi="Calibri" w:cs="Times New Roman"/>
+          <w:color w:val="2F5496"/>
+          <w:sz w:val="36"/>
+          <w:szCs w:val="32"/>
+        </w:rPr>
+        <w:t>5</w:t>
+      </w:r>
+      <w:r>
+        <w:rPr>
+          <w:rFonts w:ascii="Calibri" w:eastAsia="Times New Roman" w:hAnsi="Calibri" w:cs="Times New Roman"/>
+          <w:color w:val="2F5496"/>
+          <w:sz w:val="36"/>
+          <w:szCs w:val="32"/>
+        </w:rPr>
+        <w:t>: DATA MANAGEMENT</w:t>
+      </w:r>
+      <w:bookmarkEnd w:id="8"/>
+      <w:bookmarkEnd w:id="9"/>
+    </w:p>
+    <w:p>
+      <w:pPr>
+        <w:keepNext/>
+        <w:keepLines/>
+        <w:spacing w:before="40" w:after="0"/>
+        <w:outlineLvl w:val="1"/>
+        <w:rPr>
+          <w:rFonts w:ascii="Calibri Light" w:eastAsia="Times New Roman" w:hAnsi="Calibri Light" w:cs="Times New Roman"/>
+          <w:color w:val="2F5496"/>
+          <w:sz w:val="26"/>
+          <w:szCs w:val="26"/>
+        </w:rPr>
+      </w:pPr>
+      <w:bookmarkStart w:id="10" w:name="_Toc232587859"/>
+      <w:bookmarkStart w:id="11" w:name="_Toc232588258"/>
+      <w:r>
+        <w:rPr>
+          <w:rFonts w:ascii="Calibri Light" w:eastAsia="Times New Roman" w:hAnsi="Calibri Light" w:cs="Times New Roman"/>
+          <w:color w:val="2F5496"/>
+          <w:sz w:val="26"/>
+          <w:szCs w:val="26"/>
+        </w:rPr>
+        <w:t>PRACTICAL EXERCISE DONE</w:t>
+      </w:r>
+      <w:bookmarkEnd w:id="10"/>
+      <w:bookmarkEnd w:id="11"/>
+    </w:p>
+    <w:p>
+      <w:pPr>
+        <w:rPr>
+          <w:rFonts w:ascii="Calibri" w:eastAsia="Calibri" w:hAnsi="Calibri" w:cs="Times New Roman"/>
+          <w:sz w:val="24"/>
+          <w:szCs w:val="24"/>
+        </w:rPr>
+      </w:pPr>
+      <w:r>
+        <w:rPr>
+          <w:rFonts w:ascii="Calibri" w:eastAsia="Calibri" w:hAnsi="Calibri" w:cs="Times New Roman"/>
+          <w:sz w:val="24"/>
+          <w:szCs w:val="24"/>
+        </w:rPr>
+        <w:t>Develop an entity Record Management App with add, update, delete and search functionality.</w:t>
+      </w:r>
+    </w:p>
+    <w:p>
+      <w:pPr>
+        <w:rPr>
+          <w:rFonts w:ascii="Calibri" w:eastAsia="Calibri" w:hAnsi="Calibri" w:cs="Times New Roman"/>
+          <w:i/>
+          <w:iCs/>
+          <w:color w:val="4472C4"/>
+        </w:rPr>
+      </w:pPr>
+      <w:r>
+        <w:rPr>
+          <w:rFonts w:ascii="Calibri" w:eastAsia="Calibri" w:hAnsi="Calibri" w:cs="Times New Roman"/>
+          <w:i/>
+          <w:iCs/>
+          <w:color w:val="4472C4"/>
+        </w:rPr>
+        <w:t>Student registry APP screenshots</w:t>
+      </w:r>
+      <w:r>
+        <w:rPr>
+          <w:rFonts w:ascii="Calibri" w:eastAsia="Calibri" w:hAnsi="Calibri" w:cs="Times New Roman"/>
+          <w:noProof/>
+          <w:sz w:val="24"/>
+          <w:szCs w:val="24"/>
+        </w:rPr>
+        <w:drawing>
+          <wp:inline distT="0" distB="0" distL="0" distR="0" wp14:anchorId="41F47197" wp14:editId="59B67423">
+            <wp:extent cx="5943600" cy="3168650"/>
+            <wp:effectExtent l="0" t="0" r="0" b="0"/>
+            <wp:docPr id="29" name="Picture 29"/>
+            <wp:cNvGraphicFramePr>
+              <a:graphicFrameLocks xmlns:a="http://schemas.openxmlformats.org/drawingml/2006/main" noChangeAspect="1"/>
+            </wp:cNvGraphicFramePr>
+            <a:graphic xmlns:a="http://schemas.openxmlformats.org/drawingml/2006/main">
+              <a:graphicData uri="http://schemas.openxmlformats.org/drawingml/2006/picture">
+                <pic:pic xmlns:pic="http://schemas.openxmlformats.org/drawingml/2006/picture">
+                  <pic:nvPicPr>
+                    <pic:cNvPr id="2" name="Picture 2"/>
+                    <pic:cNvPicPr/>
+                  </pic:nvPicPr>
+                  <pic:blipFill>
+                    <a:blip r:embed="rId6" cstate="print">
+                      <a:extLst>
+                        <a:ext uri="{28A0092B-C50C-407E-A947-70E740481C1C}">
+                          <a14:useLocalDpi xmlns:a14="http://schemas.microsoft.com/office/drawing/2010/main" val="0"/>
+                        </a:ext>
+                      </a:extLst>
+                    </a:blip>
+                    <a:stretch>
+                      <a:fillRect/>
+                    </a:stretch>
+                  </pic:blipFill>
+                  <pic:spPr>
+                    <a:xfrm>
+                      <a:off x="0" y="0"/>
+                      <a:ext cx="5943600" cy="3168650"/>
+                    </a:xfrm>
+                    <a:prstGeom prst="rect">
+                      <a:avLst/>
+                    </a:prstGeom>
+                  </pic:spPr>
+                </pic:pic>
+              </a:graphicData>
+            </a:graphic>
+          </wp:inline>
+        </w:drawing>
+      </w:r>
+      <w:r>
+        <w:rPr>
+          <w:rFonts w:ascii="Calibri" w:eastAsia="Calibri" w:hAnsi="Calibri" w:cs="Times New Roman"/>
+          <w:noProof/>
+          <w:sz w:val="24"/>
+          <w:szCs w:val="24"/>
+        </w:rPr>
+        <w:lastRenderedPageBreak/>
+        <w:drawing>
+          <wp:inline distT="0" distB="0" distL="0" distR="0" wp14:anchorId="47924B17" wp14:editId="52578C2B">
             <wp:extent cx="4237990" cy="8229600"/>
             <wp:effectExtent l="0" t="0" r="0" b="0"/>
-            <wp:docPr id="4" name="Picture 4"/>
+            <wp:docPr id="30" name="Picture 30"/>
             <wp:cNvGraphicFramePr>
               <a:graphicFrameLocks xmlns:a="http://schemas.openxmlformats.org/drawingml/2006/main" noChangeAspect="1"/>
             </wp:cNvGraphicFramePr>
@@ -865,7 +1627,7 @@
                     <pic:cNvPicPr/>
                   </pic:nvPicPr>
                   <pic:blipFill>
-                    <a:blip r:embed="rId7">
+                    <a:blip r:embed="rId9">
                       <a:extLst>
                         <a:ext uri="{28A0092B-C50C-407E-A947-70E740481C1C}">
                           <a14:useLocalDpi xmlns:a14="http://schemas.microsoft.com/office/drawing/2010/main" val="0"/>
@@ -893,16 +1655,17 @@
       </w:r>
       <w:r>
         <w:rPr>
+          <w:rFonts w:ascii="Calibri" w:eastAsia="Calibri" w:hAnsi="Calibri" w:cs="Times New Roman"/>
           <w:noProof/>
           <w:sz w:val="24"/>
           <w:szCs w:val="24"/>
         </w:rPr>
         <w:lastRenderedPageBreak/>
         <w:drawing>
-          <wp:inline distT="0" distB="0" distL="0" distR="0" wp14:anchorId="41E5F878" wp14:editId="64BE9C13">
+          <wp:inline distT="0" distB="0" distL="0" distR="0" wp14:anchorId="03A92D29" wp14:editId="0C3621B7">
             <wp:extent cx="4279265" cy="8229600"/>
             <wp:effectExtent l="0" t="0" r="6985" b="0"/>
-            <wp:docPr id="7" name="Picture 7"/>
+            <wp:docPr id="31" name="Picture 31"/>
             <wp:cNvGraphicFramePr>
               <a:graphicFrameLocks xmlns:a="http://schemas.openxmlformats.org/drawingml/2006/main" noChangeAspect="1"/>
             </wp:cNvGraphicFramePr>
@@ -914,7 +1677,7 @@
                     <pic:cNvPicPr/>
                   </pic:nvPicPr>
                   <pic:blipFill>
-                    <a:blip r:embed="rId8">
+                    <a:blip r:embed="rId10">
                       <a:extLst>
                         <a:ext uri="{28A0092B-C50C-407E-A947-70E740481C1C}">
                           <a14:useLocalDpi xmlns:a14="http://schemas.microsoft.com/office/drawing/2010/main" val="0"/>
@@ -944,23 +1707,25 @@
     <w:p>
       <w:pPr>
         <w:rPr>
+          <w:rFonts w:ascii="Calibri" w:eastAsia="Calibri" w:hAnsi="Calibri" w:cs="Times New Roman"/>
           <w:i/>
           <w:iCs/>
-          <w:color w:val="4472C4" w:themeColor="accent1"/>
-        </w:rPr>
-      </w:pPr>
-      <w:r>
-        <w:rPr>
+          <w:color w:val="4472C4"/>
+        </w:rPr>
+      </w:pPr>
+      <w:r>
+        <w:rPr>
+          <w:rFonts w:ascii="Calibri" w:eastAsia="Calibri" w:hAnsi="Calibri" w:cs="Times New Roman"/>
           <w:noProof/>
           <w:sz w:val="24"/>
           <w:szCs w:val="24"/>
         </w:rPr>
         <w:lastRenderedPageBreak/>
         <w:drawing>
-          <wp:inline distT="0" distB="0" distL="0" distR="0" wp14:anchorId="4A191713" wp14:editId="174F8068">
+          <wp:inline distT="0" distB="0" distL="0" distR="0" wp14:anchorId="13B81637" wp14:editId="18390051">
             <wp:extent cx="4221480" cy="8229600"/>
             <wp:effectExtent l="0" t="0" r="7620" b="0"/>
-            <wp:docPr id="8" name="Picture 8"/>
+            <wp:docPr id="32" name="Picture 32"/>
             <wp:cNvGraphicFramePr>
               <a:graphicFrameLocks xmlns:a="http://schemas.openxmlformats.org/drawingml/2006/main" noChangeAspect="1"/>
             </wp:cNvGraphicFramePr>
@@ -972,7 +1737,7 @@
                     <pic:cNvPicPr/>
                   </pic:nvPicPr>
                   <pic:blipFill>
-                    <a:blip r:embed="rId9">
+                    <a:blip r:embed="rId7">
                       <a:extLst>
                         <a:ext uri="{28A0092B-C50C-407E-A947-70E740481C1C}">
                           <a14:useLocalDpi xmlns:a14="http://schemas.microsoft.com/office/drawing/2010/main" val="0"/>
@@ -1001,119 +1766,272 @@
     </w:p>
     <w:p>
       <w:pPr>
-        <w:pStyle w:val="Heading2"/>
-      </w:pPr>
-      <w:bookmarkStart w:id="2" w:name="_Toc232427526"/>
-      <w:r>
+        <w:keepNext/>
+        <w:keepLines/>
+        <w:spacing w:before="40" w:after="0"/>
+        <w:outlineLvl w:val="1"/>
+        <w:rPr>
+          <w:rFonts w:ascii="Calibri Light" w:eastAsia="Times New Roman" w:hAnsi="Calibri Light" w:cs="Times New Roman"/>
+          <w:color w:val="2F5496"/>
+          <w:sz w:val="26"/>
+          <w:szCs w:val="26"/>
+        </w:rPr>
+      </w:pPr>
+      <w:bookmarkStart w:id="12" w:name="_Toc232587860"/>
+      <w:bookmarkStart w:id="13" w:name="_Toc232588259"/>
+      <w:r>
+        <w:rPr>
+          <w:rFonts w:ascii="Calibri Light" w:eastAsia="Times New Roman" w:hAnsi="Calibri Light" w:cs="Times New Roman"/>
+          <w:color w:val="2F5496"/>
+          <w:sz w:val="26"/>
+          <w:szCs w:val="26"/>
+        </w:rPr>
         <w:lastRenderedPageBreak/>
         <w:t>TOOLS/SOFTWARES USED</w:t>
       </w:r>
-      <w:bookmarkEnd w:id="2"/>
-    </w:p>
-    <w:p>
-      <w:pPr>
-        <w:pStyle w:val="ListParagraph"/>
+      <w:bookmarkEnd w:id="12"/>
+      <w:bookmarkEnd w:id="13"/>
+    </w:p>
+    <w:p>
+      <w:pPr>
         <w:numPr>
           <w:ilvl w:val="0"/>
-          <w:numId w:val="4"/>
+          <w:numId w:val="5"/>
         </w:numPr>
-      </w:pPr>
-      <w:r>
+        <w:contextualSpacing/>
+        <w:rPr>
+          <w:rFonts w:ascii="Calibri" w:eastAsia="Calibri" w:hAnsi="Calibri" w:cs="Times New Roman"/>
+        </w:rPr>
+      </w:pPr>
+      <w:r>
+        <w:rPr>
+          <w:rFonts w:ascii="Calibri" w:eastAsia="Calibri" w:hAnsi="Calibri" w:cs="Times New Roman"/>
+        </w:rPr>
         <w:t>Flutter</w:t>
       </w:r>
     </w:p>
     <w:p>
       <w:pPr>
-        <w:pStyle w:val="ListParagraph"/>
         <w:numPr>
           <w:ilvl w:val="0"/>
-          <w:numId w:val="4"/>
+          <w:numId w:val="5"/>
         </w:numPr>
-      </w:pPr>
-      <w:r>
+        <w:contextualSpacing/>
+        <w:rPr>
+          <w:rFonts w:ascii="Calibri" w:eastAsia="Calibri" w:hAnsi="Calibri" w:cs="Times New Roman"/>
+        </w:rPr>
+      </w:pPr>
+      <w:r>
+        <w:rPr>
+          <w:rFonts w:ascii="Calibri" w:eastAsia="Calibri" w:hAnsi="Calibri" w:cs="Times New Roman"/>
+        </w:rPr>
         <w:t>Vs code</w:t>
       </w:r>
     </w:p>
     <w:p>
       <w:pPr>
-        <w:pStyle w:val="ListParagraph"/>
         <w:numPr>
           <w:ilvl w:val="0"/>
-          <w:numId w:val="4"/>
+          <w:numId w:val="5"/>
         </w:numPr>
-      </w:pPr>
-      <w:r>
+        <w:contextualSpacing/>
+        <w:rPr>
+          <w:rFonts w:ascii="Calibri" w:eastAsia="Calibri" w:hAnsi="Calibri" w:cs="Times New Roman"/>
+        </w:rPr>
+      </w:pPr>
+      <w:r>
+        <w:rPr>
+          <w:rFonts w:ascii="Calibri" w:eastAsia="Calibri" w:hAnsi="Calibri" w:cs="Times New Roman"/>
+        </w:rPr>
         <w:t>Android Studio</w:t>
       </w:r>
     </w:p>
     <w:p>
       <w:pPr>
-        <w:pStyle w:val="Heading2"/>
-      </w:pPr>
-      <w:bookmarkStart w:id="3" w:name="_Toc232427527"/>
-      <w:r>
+        <w:keepNext/>
+        <w:keepLines/>
+        <w:spacing w:before="40" w:after="0"/>
+        <w:outlineLvl w:val="1"/>
+        <w:rPr>
+          <w:rFonts w:ascii="Calibri Light" w:eastAsia="Times New Roman" w:hAnsi="Calibri Light" w:cs="Times New Roman"/>
+          <w:color w:val="2F5496"/>
+          <w:sz w:val="26"/>
+          <w:szCs w:val="26"/>
+        </w:rPr>
+      </w:pPr>
+      <w:bookmarkStart w:id="14" w:name="_Toc232587861"/>
+      <w:bookmarkStart w:id="15" w:name="_Toc232588260"/>
+      <w:r>
+        <w:rPr>
+          <w:rFonts w:ascii="Calibri Light" w:eastAsia="Times New Roman" w:hAnsi="Calibri Light" w:cs="Times New Roman"/>
+          <w:color w:val="2F5496"/>
+          <w:sz w:val="26"/>
+          <w:szCs w:val="26"/>
+        </w:rPr>
         <w:t>PERSONNAL REFLECTION</w:t>
       </w:r>
-      <w:bookmarkEnd w:id="3"/>
-    </w:p>
-    <w:p>
-      <w:r>
+      <w:bookmarkEnd w:id="14"/>
+      <w:bookmarkEnd w:id="15"/>
+    </w:p>
+    <w:p>
+      <w:pPr>
+        <w:rPr>
+          <w:rFonts w:ascii="Calibri" w:eastAsia="Calibri" w:hAnsi="Calibri" w:cs="Times New Roman"/>
+        </w:rPr>
+      </w:pPr>
+      <w:r>
+        <w:rPr>
+          <w:rFonts w:ascii="Calibri" w:eastAsia="Calibri" w:hAnsi="Calibri" w:cs="Times New Roman"/>
+        </w:rPr>
         <w:t>Working on the Student Record Management App helped me understand the importance of local storage and database management in mobile applications. Implementing CRUD operations strengthened my practical programming skills and problem-solving abilities. I also learned how primary keys ensure data integrity and how SQLite efficiently manages structured data locally.</w:t>
       </w:r>
     </w:p>
     <w:p>
       <w:pPr>
-        <w:pStyle w:val="Heading1"/>
-      </w:pPr>
-      <w:bookmarkStart w:id="4" w:name="_Toc232427528"/>
-      <w:r>
-        <w:t>WEEK 5: NETWORKING</w:t>
-      </w:r>
-      <w:bookmarkEnd w:id="4"/>
-    </w:p>
-    <w:p>
-      <w:r>
+        <w:rPr>
+          <w:rFonts w:ascii="Calibri" w:eastAsia="Calibri" w:hAnsi="Calibri" w:cs="Times New Roman"/>
+        </w:rPr>
+      </w:pPr>
+    </w:p>
+    <w:p>
+      <w:pPr>
+        <w:keepNext/>
+        <w:keepLines/>
+        <w:spacing w:before="240" w:after="0"/>
+        <w:outlineLvl w:val="0"/>
+        <w:rPr>
+          <w:rFonts w:ascii="Calibri" w:eastAsia="Times New Roman" w:hAnsi="Calibri" w:cs="Times New Roman"/>
+          <w:b/>
+          <w:color w:val="2F5496"/>
+          <w:sz w:val="36"/>
+          <w:szCs w:val="32"/>
+        </w:rPr>
+      </w:pPr>
+      <w:bookmarkStart w:id="16" w:name="_Toc232587862"/>
+      <w:bookmarkStart w:id="17" w:name="_Toc232588261"/>
+      <w:r>
+        <w:rPr>
+          <w:rFonts w:ascii="Calibri" w:eastAsia="Times New Roman" w:hAnsi="Calibri" w:cs="Times New Roman"/>
+          <w:b/>
+          <w:color w:val="2F5496"/>
+          <w:sz w:val="36"/>
+          <w:szCs w:val="32"/>
+        </w:rPr>
+        <w:t xml:space="preserve">WEEK </w:t>
+      </w:r>
+      <w:r>
+        <w:rPr>
+          <w:rFonts w:ascii="Calibri" w:eastAsia="Times New Roman" w:hAnsi="Calibri" w:cs="Times New Roman"/>
+          <w:b/>
+          <w:color w:val="2F5496"/>
+          <w:sz w:val="36"/>
+          <w:szCs w:val="32"/>
+        </w:rPr>
+        <w:t>6</w:t>
+      </w:r>
+      <w:r>
+        <w:rPr>
+          <w:rFonts w:ascii="Calibri" w:eastAsia="Times New Roman" w:hAnsi="Calibri" w:cs="Times New Roman"/>
+          <w:b/>
+          <w:color w:val="2F5496"/>
+          <w:sz w:val="36"/>
+          <w:szCs w:val="32"/>
+        </w:rPr>
+        <w:t>: NETWORKING</w:t>
+      </w:r>
+      <w:r>
+        <w:rPr>
+          <w:rFonts w:ascii="Calibri" w:eastAsia="Times New Roman" w:hAnsi="Calibri" w:cs="Times New Roman"/>
+          <w:b/>
+          <w:color w:val="2F5496"/>
+          <w:sz w:val="36"/>
+          <w:szCs w:val="32"/>
+        </w:rPr>
+        <w:t xml:space="preserve"> AND API</w:t>
+      </w:r>
+      <w:bookmarkEnd w:id="16"/>
+      <w:bookmarkEnd w:id="17"/>
+    </w:p>
+    <w:p>
+      <w:pPr>
+        <w:rPr>
+          <w:rFonts w:ascii="Calibri" w:eastAsia="Calibri" w:hAnsi="Calibri" w:cs="Times New Roman"/>
+        </w:rPr>
+      </w:pPr>
+      <w:r>
+        <w:rPr>
+          <w:rFonts w:ascii="Calibri" w:eastAsia="Calibri" w:hAnsi="Calibri" w:cs="Times New Roman"/>
+        </w:rPr>
         <w:t>Assignment</w:t>
       </w:r>
       <w:r>
+        <w:rPr>
+          <w:rFonts w:ascii="Calibri" w:eastAsia="Calibri" w:hAnsi="Calibri" w:cs="Times New Roman"/>
+        </w:rPr>
         <w:br/>
         <w:t>Develop a Mobile API Consumer Application that connects to a public REST API and displays records.</w:t>
       </w:r>
       <w:r>
+        <w:rPr>
+          <w:rFonts w:ascii="Calibri" w:eastAsia="Calibri" w:hAnsi="Calibri" w:cs="Times New Roman"/>
+        </w:rPr>
         <w:br/>
       </w:r>
     </w:p>
     <w:p>
       <w:pPr>
-        <w:pStyle w:val="Heading2"/>
-      </w:pPr>
-      <w:bookmarkStart w:id="5" w:name="_Toc232427529"/>
-      <w:r>
-        <w:t>PRACTICAL ACTIVITIES UNDERTAKEN</w:t>
-      </w:r>
-      <w:bookmarkEnd w:id="5"/>
-    </w:p>
-    <w:p>
-      <w:pPr>
-        <w:rPr>
-          <w:rFonts w:asciiTheme="majorHAnsi" w:eastAsiaTheme="majorEastAsia" w:hAnsiTheme="majorHAnsi" w:cstheme="majorBidi"/>
-          <w:color w:val="2F5496" w:themeColor="accent1" w:themeShade="BF"/>
+        <w:keepNext/>
+        <w:keepLines/>
+        <w:spacing w:before="40" w:after="0"/>
+        <w:outlineLvl w:val="1"/>
+        <w:rPr>
+          <w:rFonts w:ascii="Calibri Light" w:eastAsia="Times New Roman" w:hAnsi="Calibri Light" w:cs="Times New Roman"/>
+          <w:color w:val="2F5496"/>
           <w:sz w:val="26"/>
           <w:szCs w:val="26"/>
         </w:rPr>
       </w:pPr>
-    </w:p>
-    <w:p>
-      <w:r>
-        <w:rPr>
+      <w:bookmarkStart w:id="18" w:name="_Toc232587863"/>
+      <w:bookmarkStart w:id="19" w:name="_Toc232588262"/>
+      <w:r>
+        <w:rPr>
+          <w:rFonts w:ascii="Calibri Light" w:eastAsia="Times New Roman" w:hAnsi="Calibri Light" w:cs="Times New Roman"/>
+          <w:color w:val="2F5496"/>
+          <w:sz w:val="26"/>
+          <w:szCs w:val="26"/>
+        </w:rPr>
+        <w:t>PRACTICAL ACTIVITIES UNDERTAKEN</w:t>
+      </w:r>
+      <w:bookmarkEnd w:id="18"/>
+      <w:bookmarkEnd w:id="19"/>
+    </w:p>
+    <w:p>
+      <w:pPr>
+        <w:rPr>
+          <w:rFonts w:ascii="Calibri Light" w:eastAsia="Times New Roman" w:hAnsi="Calibri Light" w:cs="Times New Roman"/>
+          <w:color w:val="2F5496"/>
+          <w:sz w:val="26"/>
+          <w:szCs w:val="26"/>
+        </w:rPr>
+      </w:pPr>
+    </w:p>
+    <w:p>
+      <w:pPr>
+        <w:rPr>
+          <w:rFonts w:ascii="Calibri" w:eastAsia="Calibri" w:hAnsi="Calibri" w:cs="Times New Roman"/>
+        </w:rPr>
+      </w:pPr>
+      <w:r>
+        <w:rPr>
+          <w:rFonts w:ascii="Calibri" w:eastAsia="Calibri" w:hAnsi="Calibri" w:cs="Times New Roman"/>
           <w:noProof/>
         </w:rPr>
         <w:lastRenderedPageBreak/>
         <w:drawing>
-          <wp:inline distT="0" distB="0" distL="0" distR="0" wp14:anchorId="4A756A73" wp14:editId="15A69BCD">
+          <wp:inline distT="0" distB="0" distL="0" distR="0" wp14:anchorId="5DCDF013" wp14:editId="40800223">
             <wp:extent cx="5943600" cy="3183890"/>
             <wp:effectExtent l="0" t="0" r="0" b="0"/>
-            <wp:docPr id="6" name="Picture 6"/>
+            <wp:docPr id="40" name="Picture 40"/>
             <wp:cNvGraphicFramePr>
               <a:graphicFrameLocks xmlns:a="http://schemas.openxmlformats.org/drawingml/2006/main" noChangeAspect="1"/>
             </wp:cNvGraphicFramePr>
@@ -1125,7 +2043,7 @@
                     <pic:cNvPicPr/>
                   </pic:nvPicPr>
                   <pic:blipFill>
-                    <a:blip r:embed="rId10" cstate="print">
+                    <a:blip r:embed="rId11" cstate="print">
                       <a:extLst>
                         <a:ext uri="{28A0092B-C50C-407E-A947-70E740481C1C}">
                           <a14:useLocalDpi xmlns:a14="http://schemas.microsoft.com/office/drawing/2010/main" val="0"/>
@@ -1153,13 +2071,14 @@
       </w:r>
       <w:r>
         <w:rPr>
+          <w:rFonts w:ascii="Calibri" w:eastAsia="Calibri" w:hAnsi="Calibri" w:cs="Times New Roman"/>
           <w:noProof/>
         </w:rPr>
         <w:drawing>
-          <wp:inline distT="0" distB="0" distL="0" distR="0" wp14:anchorId="268A44F4" wp14:editId="15423DF9">
+          <wp:inline distT="0" distB="0" distL="0" distR="0" wp14:anchorId="09DECE83" wp14:editId="43A52A3E">
             <wp:extent cx="5943600" cy="3213100"/>
             <wp:effectExtent l="0" t="0" r="0" b="6350"/>
-            <wp:docPr id="9" name="Picture 9"/>
+            <wp:docPr id="41" name="Picture 41"/>
             <wp:cNvGraphicFramePr>
               <a:graphicFrameLocks xmlns:a="http://schemas.openxmlformats.org/drawingml/2006/main" noChangeAspect="1"/>
             </wp:cNvGraphicFramePr>
@@ -1171,7 +2090,7 @@
                     <pic:cNvPicPr/>
                   </pic:nvPicPr>
                   <pic:blipFill>
-                    <a:blip r:embed="rId11" cstate="print">
+                    <a:blip r:embed="rId12" cstate="print">
                       <a:extLst>
                         <a:ext uri="{28A0092B-C50C-407E-A947-70E740481C1C}">
                           <a14:useLocalDpi xmlns:a14="http://schemas.microsoft.com/office/drawing/2010/main" val="0"/>
@@ -1199,16 +2118,22 @@
       </w:r>
     </w:p>
     <w:p>
-      <w:r>
-        <w:rPr>
+      <w:pPr>
+        <w:rPr>
+          <w:rFonts w:ascii="Calibri" w:eastAsia="Calibri" w:hAnsi="Calibri" w:cs="Times New Roman"/>
+        </w:rPr>
+      </w:pPr>
+      <w:r>
+        <w:rPr>
+          <w:rFonts w:ascii="Calibri" w:eastAsia="Calibri" w:hAnsi="Calibri" w:cs="Times New Roman"/>
           <w:noProof/>
         </w:rPr>
         <w:lastRenderedPageBreak/>
         <w:drawing>
-          <wp:inline distT="0" distB="0" distL="0" distR="0" wp14:anchorId="30819EC9" wp14:editId="4FE73DAD">
+          <wp:inline distT="0" distB="0" distL="0" distR="0" wp14:anchorId="32525E45" wp14:editId="1CF75D6D">
             <wp:extent cx="4283710" cy="8229600"/>
             <wp:effectExtent l="0" t="0" r="2540" b="0"/>
-            <wp:docPr id="10" name="Picture 10"/>
+            <wp:docPr id="42" name="Picture 42"/>
             <wp:cNvGraphicFramePr>
               <a:graphicFrameLocks xmlns:a="http://schemas.openxmlformats.org/drawingml/2006/main" noChangeAspect="1"/>
             </wp:cNvGraphicFramePr>
@@ -1220,7 +2145,7 @@
                     <pic:cNvPicPr/>
                   </pic:nvPicPr>
                   <pic:blipFill>
-                    <a:blip r:embed="rId12">
+                    <a:blip r:embed="rId13">
                       <a:extLst>
                         <a:ext uri="{28A0092B-C50C-407E-A947-70E740481C1C}">
                           <a14:useLocalDpi xmlns:a14="http://schemas.microsoft.com/office/drawing/2010/main" val="0"/>
@@ -1249,75 +2174,154 @@
     </w:p>
     <w:p>
       <w:pPr>
-        <w:pStyle w:val="Heading2"/>
-      </w:pPr>
-      <w:bookmarkStart w:id="6" w:name="_Toc232427530"/>
-      <w:r>
+        <w:keepNext/>
+        <w:keepLines/>
+        <w:spacing w:before="40" w:after="0"/>
+        <w:outlineLvl w:val="1"/>
+        <w:rPr>
+          <w:rFonts w:ascii="Calibri Light" w:eastAsia="Times New Roman" w:hAnsi="Calibri Light" w:cs="Times New Roman"/>
+          <w:color w:val="2F5496"/>
+          <w:sz w:val="26"/>
+          <w:szCs w:val="26"/>
+        </w:rPr>
+      </w:pPr>
+      <w:bookmarkStart w:id="20" w:name="_Toc232587864"/>
+      <w:bookmarkStart w:id="21" w:name="_Toc232588263"/>
+      <w:r>
+        <w:rPr>
+          <w:rFonts w:ascii="Calibri Light" w:eastAsia="Times New Roman" w:hAnsi="Calibri Light" w:cs="Times New Roman"/>
+          <w:color w:val="2F5496"/>
+          <w:sz w:val="26"/>
+          <w:szCs w:val="26"/>
+        </w:rPr>
         <w:lastRenderedPageBreak/>
         <w:t>TOOLS/SOFTWARE USED</w:t>
       </w:r>
-      <w:bookmarkEnd w:id="6"/>
-    </w:p>
-    <w:p>
-      <w:pPr>
-        <w:pStyle w:val="ListParagraph"/>
+      <w:bookmarkEnd w:id="20"/>
+      <w:bookmarkEnd w:id="21"/>
+    </w:p>
+    <w:p>
+      <w:pPr>
         <w:numPr>
           <w:ilvl w:val="1"/>
           <w:numId w:val="2"/>
         </w:numPr>
-      </w:pPr>
-      <w:r>
+        <w:contextualSpacing/>
+        <w:rPr>
+          <w:rFonts w:ascii="Calibri" w:eastAsia="Calibri" w:hAnsi="Calibri" w:cs="Times New Roman"/>
+        </w:rPr>
+      </w:pPr>
+      <w:r>
+        <w:rPr>
+          <w:rFonts w:ascii="Calibri" w:eastAsia="Calibri" w:hAnsi="Calibri" w:cs="Times New Roman"/>
+        </w:rPr>
         <w:t>Flutter</w:t>
       </w:r>
     </w:p>
     <w:p>
       <w:pPr>
-        <w:pStyle w:val="ListParagraph"/>
         <w:numPr>
           <w:ilvl w:val="1"/>
           <w:numId w:val="2"/>
         </w:numPr>
-      </w:pPr>
-      <w:r>
+        <w:contextualSpacing/>
+        <w:rPr>
+          <w:rFonts w:ascii="Calibri" w:eastAsia="Calibri" w:hAnsi="Calibri" w:cs="Times New Roman"/>
+        </w:rPr>
+      </w:pPr>
+      <w:r>
+        <w:rPr>
+          <w:rFonts w:ascii="Calibri" w:eastAsia="Calibri" w:hAnsi="Calibri" w:cs="Times New Roman"/>
+        </w:rPr>
         <w:t>VS code</w:t>
       </w:r>
     </w:p>
     <w:p>
       <w:pPr>
-        <w:pStyle w:val="ListParagraph"/>
         <w:numPr>
           <w:ilvl w:val="1"/>
           <w:numId w:val="2"/>
         </w:numPr>
-      </w:pPr>
-      <w:r>
+        <w:contextualSpacing/>
+        <w:rPr>
+          <w:rFonts w:ascii="Calibri" w:eastAsia="Calibri" w:hAnsi="Calibri" w:cs="Times New Roman"/>
+        </w:rPr>
+      </w:pPr>
+      <w:r>
+        <w:rPr>
+          <w:rFonts w:ascii="Calibri" w:eastAsia="Calibri" w:hAnsi="Calibri" w:cs="Times New Roman"/>
+        </w:rPr>
         <w:t>Android studio</w:t>
       </w:r>
     </w:p>
     <w:p>
       <w:pPr>
-        <w:pStyle w:val="Heading2"/>
-      </w:pPr>
-      <w:bookmarkStart w:id="7" w:name="_Toc232427531"/>
-      <w:r>
+        <w:keepNext/>
+        <w:keepLines/>
+        <w:spacing w:before="40" w:after="0"/>
+        <w:outlineLvl w:val="1"/>
+        <w:rPr>
+          <w:rFonts w:ascii="Calibri Light" w:eastAsia="Times New Roman" w:hAnsi="Calibri Light" w:cs="Times New Roman"/>
+          <w:color w:val="2F5496"/>
+          <w:sz w:val="26"/>
+          <w:szCs w:val="26"/>
+        </w:rPr>
+      </w:pPr>
+      <w:bookmarkStart w:id="22" w:name="_Toc232587865"/>
+      <w:bookmarkStart w:id="23" w:name="_Toc232588264"/>
+      <w:r>
+        <w:rPr>
+          <w:rFonts w:ascii="Calibri Light" w:eastAsia="Times New Roman" w:hAnsi="Calibri Light" w:cs="Times New Roman"/>
+          <w:color w:val="2F5496"/>
+          <w:sz w:val="26"/>
+          <w:szCs w:val="26"/>
+        </w:rPr>
         <w:t>PERSONNAL REFLECTION</w:t>
       </w:r>
-      <w:bookmarkEnd w:id="7"/>
-    </w:p>
-    <w:p>
-      <w:r>
+      <w:bookmarkEnd w:id="22"/>
+      <w:bookmarkEnd w:id="23"/>
+    </w:p>
+    <w:p>
+      <w:pPr>
+        <w:rPr>
+          <w:rFonts w:ascii="Calibri" w:eastAsia="Calibri" w:hAnsi="Calibri" w:cs="Times New Roman"/>
+        </w:rPr>
+      </w:pPr>
+      <w:r>
+        <w:rPr>
+          <w:rFonts w:ascii="Calibri" w:eastAsia="Calibri" w:hAnsi="Calibri" w:cs="Times New Roman"/>
+        </w:rPr>
         <w:t>Developing the Weather Forecast App enhanced my understanding of networking concepts and REST APIs in Flutter. I learned how to make asynchronous HTTP requests, parse JSON data, and handle errors effectively. The project strengthened my practical skills in API integration, user interface design, and displaying real-time data from web services.</w:t>
       </w:r>
     </w:p>
     <w:p>
       <w:pPr>
-        <w:pStyle w:val="Heading1"/>
-      </w:pPr>
-      <w:bookmarkStart w:id="8" w:name="_Toc232427532"/>
-      <w:r>
+        <w:keepNext/>
+        <w:keepLines/>
+        <w:spacing w:before="240" w:after="0"/>
+        <w:outlineLvl w:val="0"/>
+        <w:rPr>
+          <w:rFonts w:ascii="Calibri" w:eastAsia="Times New Roman" w:hAnsi="Calibri" w:cs="Times New Roman"/>
+          <w:b/>
+          <w:color w:val="2F5496"/>
+          <w:sz w:val="36"/>
+          <w:szCs w:val="32"/>
+        </w:rPr>
+      </w:pPr>
+      <w:bookmarkStart w:id="24" w:name="_Toc232587866"/>
+      <w:bookmarkStart w:id="25" w:name="_Toc232588265"/>
+      <w:r>
+        <w:rPr>
+          <w:rFonts w:ascii="Calibri" w:eastAsia="Times New Roman" w:hAnsi="Calibri" w:cs="Times New Roman"/>
+          <w:b/>
+          <w:color w:val="2F5496"/>
+          <w:sz w:val="36"/>
+          <w:szCs w:val="32"/>
+        </w:rPr>
         <w:t>REPORT</w:t>
       </w:r>
-      <w:bookmarkEnd w:id="8"/>
+      <w:bookmarkEnd w:id="24"/>
+      <w:bookmarkEnd w:id="25"/>
     </w:p>
     <w:p>
       <w:r>
@@ -1635,6 +2639,95 @@
     </w:lvl>
   </w:abstractNum>
   <w:abstractNum w:abstractNumId="2" w15:restartNumberingAfterBreak="0">
+    <w:nsid w:val="47C51646"/>
+    <w:multiLevelType w:val="hybridMultilevel"/>
+    <w:tmpl w:val="3C62DD08"/>
+    <w:lvl w:ilvl="0" w:tplc="9ACE6F66">
+      <w:start w:val="1"/>
+      <w:numFmt w:val="lowerRoman"/>
+      <w:lvlText w:val="%1."/>
+      <w:lvlJc w:val="left"/>
+      <w:pPr>
+        <w:ind w:left="1080" w:hanging="720"/>
+      </w:pPr>
+      <w:rPr>
+        <w:rFonts w:hint="default"/>
+      </w:rPr>
+    </w:lvl>
+    <w:lvl w:ilvl="1" w:tplc="04090019" w:tentative="1">
+      <w:start w:val="1"/>
+      <w:numFmt w:val="lowerLetter"/>
+      <w:lvlText w:val="%2."/>
+      <w:lvlJc w:val="left"/>
+      <w:pPr>
+        <w:ind w:left="1440" w:hanging="360"/>
+      </w:pPr>
+    </w:lvl>
+    <w:lvl w:ilvl="2" w:tplc="0409001B" w:tentative="1">
+      <w:start w:val="1"/>
+      <w:numFmt w:val="lowerRoman"/>
+      <w:lvlText w:val="%3."/>
+      <w:lvlJc w:val="right"/>
+      <w:pPr>
+        <w:ind w:left="2160" w:hanging="180"/>
+      </w:pPr>
+    </w:lvl>
+    <w:lvl w:ilvl="3" w:tplc="0409000F" w:tentative="1">
+      <w:start w:val="1"/>
+      <w:numFmt w:val="decimal"/>
+      <w:lvlText w:val="%4."/>
+      <w:lvlJc w:val="left"/>
+      <w:pPr>
+        <w:ind w:left="2880" w:hanging="360"/>
+      </w:pPr>
+    </w:lvl>
+    <w:lvl w:ilvl="4" w:tplc="04090019" w:tentative="1">
+      <w:start w:val="1"/>
+      <w:numFmt w:val="lowerLetter"/>
+      <w:lvlText w:val="%5."/>
+      <w:lvlJc w:val="left"/>
+      <w:pPr>
+        <w:ind w:left="3600" w:hanging="360"/>
+      </w:pPr>
+    </w:lvl>
+    <w:lvl w:ilvl="5" w:tplc="0409001B" w:tentative="1">
+      <w:start w:val="1"/>
+      <w:numFmt w:val="lowerRoman"/>
+      <w:lvlText w:val="%6."/>
+      <w:lvlJc w:val="right"/>
+      <w:pPr>
+        <w:ind w:left="4320" w:hanging="180"/>
+      </w:pPr>
+    </w:lvl>
+    <w:lvl w:ilvl="6" w:tplc="0409000F" w:tentative="1">
+      <w:start w:val="1"/>
+      <w:numFmt w:val="decimal"/>
+      <w:lvlText w:val="%7."/>
+      <w:lvlJc w:val="left"/>
+      <w:pPr>
+        <w:ind w:left="5040" w:hanging="360"/>
+      </w:pPr>
+    </w:lvl>
+    <w:lvl w:ilvl="7" w:tplc="04090019" w:tentative="1">
+      <w:start w:val="1"/>
+      <w:numFmt w:val="lowerLetter"/>
+      <w:lvlText w:val="%8."/>
+      <w:lvlJc w:val="left"/>
+      <w:pPr>
+        <w:ind w:left="5760" w:hanging="360"/>
+      </w:pPr>
+    </w:lvl>
+    <w:lvl w:ilvl="8" w:tplc="0409001B" w:tentative="1">
+      <w:start w:val="1"/>
+      <w:numFmt w:val="lowerRoman"/>
+      <w:lvlText w:val="%9."/>
+      <w:lvlJc w:val="right"/>
+      <w:pPr>
+        <w:ind w:left="6480" w:hanging="180"/>
+      </w:pPr>
+    </w:lvl>
+  </w:abstractNum>
+  <w:abstractNum w:abstractNumId="3" w15:restartNumberingAfterBreak="0">
     <w:nsid w:val="61EA1B28"/>
     <w:multiLevelType w:val="hybridMultilevel"/>
     <w:tmpl w:val="3C62DD08"/>
@@ -1723,7 +2816,7 @@
       </w:pPr>
     </w:lvl>
   </w:abstractNum>
-  <w:abstractNum w:abstractNumId="3" w15:restartNumberingAfterBreak="0">
+  <w:abstractNum w:abstractNumId="4" w15:restartNumberingAfterBreak="0">
     <w:nsid w:val="62553369"/>
     <w:multiLevelType w:val="multilevel"/>
     <w:tmpl w:val="CC345D70"/>
@@ -1872,12 +2965,15 @@
     <w:abstractNumId w:val="1"/>
   </w:num>
   <w:num w:numId="2">
-    <w:abstractNumId w:val="3"/>
+    <w:abstractNumId w:val="4"/>
   </w:num>
   <w:num w:numId="3">
     <w:abstractNumId w:val="0"/>
   </w:num>
   <w:num w:numId="4">
+    <w:abstractNumId w:val="3"/>
+  </w:num>
+  <w:num w:numId="5">
     <w:abstractNumId w:val="2"/>
   </w:num>
 </w:numbering>
@@ -2290,7 +3386,7 @@
     <w:autoRedefine/>
     <w:uiPriority w:val="9"/>
     <w:qFormat/>
-    <w:rsid w:val="00C30580"/>
+    <w:rsid w:val="000F26ED"/>
     <w:pPr>
       <w:keepNext/>
       <w:keepLines/>
@@ -2298,8 +3394,8 @@
       <w:outlineLvl w:val="0"/>
     </w:pPr>
     <w:rPr>
-      <w:rFonts w:eastAsiaTheme="majorEastAsia" w:cstheme="majorBidi"/>
-      <w:b/>
+      <w:rFonts w:ascii="Calibri" w:eastAsia="Calibri" w:hAnsi="Calibri" w:cs="Times New Roman"/>
+      <w:bCs/>
       <w:color w:val="2F5496" w:themeColor="accent1" w:themeShade="BF"/>
       <w:sz w:val="36"/>
       <w:szCs w:val="32"/>
@@ -2330,6 +3426,7 @@
   <w:style w:type="character" w:default="1" w:styleId="DefaultParagraphFont">
     <w:name w:val="Default Paragraph Font"/>
     <w:uiPriority w:val="1"/>
+    <w:semiHidden/>
     <w:unhideWhenUsed/>
   </w:style>
   <w:style w:type="table" w:default="1" w:styleId="TableNormal">
@@ -2478,10 +3575,10 @@
     <w:basedOn w:val="DefaultParagraphFont"/>
     <w:link w:val="Heading1"/>
     <w:uiPriority w:val="9"/>
-    <w:rsid w:val="00C30580"/>
+    <w:rsid w:val="000F26ED"/>
     <w:rPr>
-      <w:rFonts w:eastAsiaTheme="majorEastAsia" w:cstheme="majorBidi"/>
-      <w:b/>
+      <w:rFonts w:ascii="Calibri" w:eastAsia="Calibri" w:hAnsi="Calibri" w:cs="Times New Roman"/>
+      <w:bCs/>
       <w:color w:val="2F5496" w:themeColor="accent1" w:themeShade="BF"/>
       <w:sz w:val="36"/>
       <w:szCs w:val="32"/>

</xml_diff>

<commit_message>
Update all assignment documents and logbook to latest versions
</commit_message>
<xml_diff>
--- a/WEEK 1 TO WEEK 6 ASSIGNMENT VERSION 2.docx
+++ b/WEEK 1 TO WEEK 6 ASSIGNMENT VERSION 2.docx
@@ -45,6 +45,7 @@
         <w:rPr>
           <w:rFonts w:asciiTheme="minorHAnsi" w:eastAsiaTheme="minorHAnsi" w:hAnsiTheme="minorHAnsi" w:cstheme="minorBidi"/>
           <w:b/>
+          <w:bCs w:val="0"/>
           <w:color w:val="auto"/>
           <w:sz w:val="22"/>
           <w:szCs w:val="22"/>
@@ -90,7 +91,7 @@
           <w:r>
             <w:fldChar w:fldCharType="separate"/>
           </w:r>
-          <w:hyperlink w:anchor="_Toc232588253" w:history="1">
+          <w:hyperlink w:anchor="_Toc232592547" w:history="1">
             <w:r>
               <w:rPr>
                 <w:rStyle w:val="Hyperlink"/>
@@ -118,7 +119,7 @@
                 <w:noProof/>
                 <w:webHidden/>
               </w:rPr>
-              <w:instrText xml:space="preserve"> PAGEREF _Toc232588253 \h </w:instrText>
+              <w:instrText xml:space="preserve"> PAGEREF _Toc232592547 \h </w:instrText>
             </w:r>
             <w:r>
               <w:rPr>
@@ -160,7 +161,7 @@
               <w:noProof/>
             </w:rPr>
           </w:pPr>
-          <w:hyperlink w:anchor="_Toc232588254" w:history="1">
+          <w:hyperlink w:anchor="_Toc232592548" w:history="1">
             <w:r>
               <w:rPr>
                 <w:rStyle w:val="Hyperlink"/>
@@ -188,7 +189,7 @@
                 <w:noProof/>
                 <w:webHidden/>
               </w:rPr>
-              <w:instrText xml:space="preserve"> PAGEREF _Toc232588254 \h </w:instrText>
+              <w:instrText xml:space="preserve"> PAGEREF _Toc232592548 \h </w:instrText>
             </w:r>
             <w:r>
               <w:rPr>
@@ -230,7 +231,7 @@
               <w:noProof/>
             </w:rPr>
           </w:pPr>
-          <w:hyperlink w:anchor="_Toc232588255" w:history="1">
+          <w:hyperlink w:anchor="_Toc232592549" w:history="1">
             <w:r>
               <w:rPr>
                 <w:rStyle w:val="Hyperlink"/>
@@ -258,7 +259,7 @@
                 <w:noProof/>
                 <w:webHidden/>
               </w:rPr>
-              <w:instrText xml:space="preserve"> PAGEREF _Toc232588255 \h </w:instrText>
+              <w:instrText xml:space="preserve"> PAGEREF _Toc232592549 \h </w:instrText>
             </w:r>
             <w:r>
               <w:rPr>
@@ -300,7 +301,7 @@
               <w:noProof/>
             </w:rPr>
           </w:pPr>
-          <w:hyperlink w:anchor="_Toc232588256" w:history="1">
+          <w:hyperlink w:anchor="_Toc232592550" w:history="1">
             <w:r>
               <w:rPr>
                 <w:rStyle w:val="Hyperlink"/>
@@ -328,7 +329,7 @@
                 <w:noProof/>
                 <w:webHidden/>
               </w:rPr>
-              <w:instrText xml:space="preserve"> PAGEREF _Toc232588256 \h </w:instrText>
+              <w:instrText xml:space="preserve"> PAGEREF _Toc232592550 \h </w:instrText>
             </w:r>
             <w:r>
               <w:rPr>
@@ -370,7 +371,7 @@
               <w:noProof/>
             </w:rPr>
           </w:pPr>
-          <w:hyperlink w:anchor="_Toc232588257" w:history="1">
+          <w:hyperlink w:anchor="_Toc232592551" w:history="1">
             <w:r>
               <w:rPr>
                 <w:rStyle w:val="Hyperlink"/>
@@ -398,7 +399,7 @@
                 <w:noProof/>
                 <w:webHidden/>
               </w:rPr>
-              <w:instrText xml:space="preserve"> PAGEREF _Toc232588257 \h </w:instrText>
+              <w:instrText xml:space="preserve"> PAGEREF _Toc232592551 \h </w:instrText>
             </w:r>
             <w:r>
               <w:rPr>
@@ -440,7 +441,7 @@
               <w:noProof/>
             </w:rPr>
           </w:pPr>
-          <w:hyperlink w:anchor="_Toc232588258" w:history="1">
+          <w:hyperlink w:anchor="_Toc232592552" w:history="1">
             <w:r>
               <w:rPr>
                 <w:rStyle w:val="Hyperlink"/>
@@ -468,7 +469,7 @@
                 <w:noProof/>
                 <w:webHidden/>
               </w:rPr>
-              <w:instrText xml:space="preserve"> PAGEREF _Toc232588258 \h </w:instrText>
+              <w:instrText xml:space="preserve"> PAGEREF _Toc232592552 \h </w:instrText>
             </w:r>
             <w:r>
               <w:rPr>
@@ -510,7 +511,7 @@
               <w:noProof/>
             </w:rPr>
           </w:pPr>
-          <w:hyperlink w:anchor="_Toc232588259" w:history="1">
+          <w:hyperlink w:anchor="_Toc232592553" w:history="1">
             <w:r>
               <w:rPr>
                 <w:rStyle w:val="Hyperlink"/>
@@ -538,7 +539,7 @@
                 <w:noProof/>
                 <w:webHidden/>
               </w:rPr>
-              <w:instrText xml:space="preserve"> PAGEREF _Toc232588259 \h </w:instrText>
+              <w:instrText xml:space="preserve"> PAGEREF _Toc232592553 \h </w:instrText>
             </w:r>
             <w:r>
               <w:rPr>
@@ -580,7 +581,7 @@
               <w:noProof/>
             </w:rPr>
           </w:pPr>
-          <w:hyperlink w:anchor="_Toc232588260" w:history="1">
+          <w:hyperlink w:anchor="_Toc232592554" w:history="1">
             <w:r>
               <w:rPr>
                 <w:rStyle w:val="Hyperlink"/>
@@ -608,7 +609,7 @@
                 <w:noProof/>
                 <w:webHidden/>
               </w:rPr>
-              <w:instrText xml:space="preserve"> PAGEREF _Toc232588260 \h </w:instrText>
+              <w:instrText xml:space="preserve"> PAGEREF _Toc232592554 \h </w:instrText>
             </w:r>
             <w:r>
               <w:rPr>
@@ -650,7 +651,7 @@
               <w:noProof/>
             </w:rPr>
           </w:pPr>
-          <w:hyperlink w:anchor="_Toc232588261" w:history="1">
+          <w:hyperlink w:anchor="_Toc232592555" w:history="1">
             <w:r>
               <w:rPr>
                 <w:rStyle w:val="Hyperlink"/>
@@ -679,7 +680,7 @@
                 <w:noProof/>
                 <w:webHidden/>
               </w:rPr>
-              <w:instrText xml:space="preserve"> PAGEREF _Toc232588261 \h </w:instrText>
+              <w:instrText xml:space="preserve"> PAGEREF _Toc232592555 \h </w:instrText>
             </w:r>
             <w:r>
               <w:rPr>
@@ -721,7 +722,7 @@
               <w:noProof/>
             </w:rPr>
           </w:pPr>
-          <w:hyperlink w:anchor="_Toc232588262" w:history="1">
+          <w:hyperlink w:anchor="_Toc232592556" w:history="1">
             <w:r>
               <w:rPr>
                 <w:rStyle w:val="Hyperlink"/>
@@ -749,7 +750,7 @@
                 <w:noProof/>
                 <w:webHidden/>
               </w:rPr>
-              <w:instrText xml:space="preserve"> PAGEREF _Toc232588262 \h </w:instrText>
+              <w:instrText xml:space="preserve"> PAGEREF _Toc232592556 \h </w:instrText>
             </w:r>
             <w:r>
               <w:rPr>
@@ -791,7 +792,7 @@
               <w:noProof/>
             </w:rPr>
           </w:pPr>
-          <w:hyperlink w:anchor="_Toc232588263" w:history="1">
+          <w:hyperlink w:anchor="_Toc232592557" w:history="1">
             <w:r>
               <w:rPr>
                 <w:rStyle w:val="Hyperlink"/>
@@ -819,7 +820,7 @@
                 <w:noProof/>
                 <w:webHidden/>
               </w:rPr>
-              <w:instrText xml:space="preserve"> PAGEREF _Toc232588263 \h </w:instrText>
+              <w:instrText xml:space="preserve"> PAGEREF _Toc232592557 \h </w:instrText>
             </w:r>
             <w:r>
               <w:rPr>
@@ -861,7 +862,7 @@
               <w:noProof/>
             </w:rPr>
           </w:pPr>
-          <w:hyperlink w:anchor="_Toc232588264" w:history="1">
+          <w:hyperlink w:anchor="_Toc232592558" w:history="1">
             <w:r>
               <w:rPr>
                 <w:rStyle w:val="Hyperlink"/>
@@ -889,7 +890,7 @@
                 <w:noProof/>
                 <w:webHidden/>
               </w:rPr>
-              <w:instrText xml:space="preserve"> PAGEREF _Toc232588264 \h </w:instrText>
+              <w:instrText xml:space="preserve"> PAGEREF _Toc232592558 \h </w:instrText>
             </w:r>
             <w:r>
               <w:rPr>
@@ -931,7 +932,7 @@
               <w:noProof/>
             </w:rPr>
           </w:pPr>
-          <w:hyperlink w:anchor="_Toc232588265" w:history="1">
+          <w:hyperlink w:anchor="_Toc232592559" w:history="1">
             <w:r>
               <w:rPr>
                 <w:rStyle w:val="Hyperlink"/>
@@ -960,7 +961,7 @@
                 <w:noProof/>
                 <w:webHidden/>
               </w:rPr>
-              <w:instrText xml:space="preserve"> PAGEREF _Toc232588265 \h </w:instrText>
+              <w:instrText xml:space="preserve"> PAGEREF _Toc232592559 \h </w:instrText>
             </w:r>
             <w:r>
               <w:rPr>
@@ -1034,6 +1035,27 @@
     </w:p>
     <w:p>
       <w:pPr>
+        <w:rPr>
+          <w:rFonts w:ascii="Calibri" w:eastAsia="Calibri" w:hAnsi="Calibri" w:cs="Times New Roman"/>
+          <w:b/>
+          <w:bCs/>
+          <w:sz w:val="24"/>
+          <w:szCs w:val="24"/>
+        </w:rPr>
+      </w:pPr>
+    </w:p>
+    <w:p>
+      <w:pPr>
+        <w:rPr>
+          <w:b/>
+          <w:bCs/>
+          <w:sz w:val="24"/>
+          <w:szCs w:val="24"/>
+        </w:rPr>
+      </w:pPr>
+    </w:p>
+    <w:p>
+      <w:pPr>
         <w:keepNext/>
         <w:keepLines/>
         <w:spacing w:before="240" w:after="0"/>
@@ -1047,6 +1069,7 @@
       </w:pPr>
       <w:bookmarkStart w:id="0" w:name="_Toc232587854"/>
       <w:bookmarkStart w:id="1" w:name="_Toc232588253"/>
+      <w:bookmarkStart w:id="2" w:name="_Toc232592547"/>
       <w:r>
         <w:rPr>
           <w:rFonts w:ascii="Calibri" w:eastAsia="Times New Roman" w:hAnsi="Calibri" w:cs="Times New Roman"/>
@@ -1085,6 +1108,7 @@
       </w:r>
       <w:bookmarkEnd w:id="0"/>
       <w:bookmarkEnd w:id="1"/>
+      <w:bookmarkEnd w:id="2"/>
     </w:p>
     <w:p>
       <w:pPr>
@@ -1099,8 +1123,9 @@
           <w:szCs w:val="26"/>
         </w:rPr>
       </w:pPr>
-      <w:bookmarkStart w:id="2" w:name="_Toc232587855"/>
-      <w:bookmarkStart w:id="3" w:name="_Toc232588254"/>
+      <w:bookmarkStart w:id="3" w:name="_Toc232587855"/>
+      <w:bookmarkStart w:id="4" w:name="_Toc232588254"/>
+      <w:bookmarkStart w:id="5" w:name="_Toc232592548"/>
       <w:r>
         <w:rPr>
           <w:rFonts w:ascii="Calibri Light" w:eastAsia="Times New Roman" w:hAnsi="Calibri Light" w:cs="Times New Roman"/>
@@ -1110,8 +1135,9 @@
         </w:rPr>
         <w:t>PRACTICAL EXERCISE DONE</w:t>
       </w:r>
-      <w:bookmarkEnd w:id="2"/>
       <w:bookmarkEnd w:id="3"/>
+      <w:bookmarkEnd w:id="4"/>
+      <w:bookmarkEnd w:id="5"/>
     </w:p>
     <w:p>
       <w:pPr>
@@ -1156,7 +1182,7 @@
           <w:szCs w:val="24"/>
         </w:rPr>
         <w:drawing>
-          <wp:inline distT="0" distB="0" distL="0" distR="0" wp14:anchorId="4F6FAF14" wp14:editId="0A9C8210">
+          <wp:inline distT="0" distB="0" distL="0" distR="0" wp14:anchorId="091C86B1" wp14:editId="2667DA4B">
             <wp:extent cx="5943600" cy="3168650"/>
             <wp:effectExtent l="0" t="0" r="0" b="0"/>
             <wp:docPr id="36" name="Picture 36"/>
@@ -1171,7 +1197,7 @@
                     <pic:cNvPicPr/>
                   </pic:nvPicPr>
                   <pic:blipFill>
-                    <a:blip r:embed="rId6" cstate="print">
+                    <a:blip r:embed="rId8" cstate="print">
                       <a:extLst>
                         <a:ext uri="{28A0092B-C50C-407E-A947-70E740481C1C}">
                           <a14:useLocalDpi xmlns:a14="http://schemas.microsoft.com/office/drawing/2010/main" val="0"/>
@@ -1216,7 +1242,7 @@
         </w:rPr>
         <w:lastRenderedPageBreak/>
         <w:drawing>
-          <wp:inline distT="0" distB="0" distL="0" distR="0" wp14:anchorId="31365397" wp14:editId="0C318F0A">
+          <wp:inline distT="0" distB="0" distL="0" distR="0" wp14:anchorId="792E263E" wp14:editId="7A7DFECC">
             <wp:extent cx="4221480" cy="8229600"/>
             <wp:effectExtent l="0" t="0" r="7620" b="0"/>
             <wp:docPr id="39" name="Picture 39"/>
@@ -1231,7 +1257,7 @@
                     <pic:cNvPicPr/>
                   </pic:nvPicPr>
                   <pic:blipFill>
-                    <a:blip r:embed="rId7">
+                    <a:blip r:embed="rId9">
                       <a:extLst>
                         <a:ext uri="{28A0092B-C50C-407E-A947-70E740481C1C}">
                           <a14:useLocalDpi xmlns:a14="http://schemas.microsoft.com/office/drawing/2010/main" val="0"/>
@@ -1277,7 +1303,7 @@
         </w:rPr>
         <w:lastRenderedPageBreak/>
         <w:drawing>
-          <wp:inline distT="0" distB="0" distL="0" distR="0" wp14:anchorId="64493B89" wp14:editId="687DECDB">
+          <wp:inline distT="0" distB="0" distL="0" distR="0" wp14:anchorId="4EA4D610" wp14:editId="24B50AB1">
             <wp:extent cx="4206240" cy="8229600"/>
             <wp:effectExtent l="0" t="0" r="3810" b="0"/>
             <wp:docPr id="33" name="Picture 33"/>
@@ -1292,7 +1318,7 @@
                     <pic:cNvPicPr/>
                   </pic:nvPicPr>
                   <pic:blipFill>
-                    <a:blip r:embed="rId8"/>
+                    <a:blip r:embed="rId10"/>
                     <a:stretch>
                       <a:fillRect/>
                     </a:stretch>
@@ -1326,8 +1352,9 @@
           <w:szCs w:val="26"/>
         </w:rPr>
       </w:pPr>
-      <w:bookmarkStart w:id="4" w:name="_Toc232587856"/>
-      <w:bookmarkStart w:id="5" w:name="_Toc232588255"/>
+      <w:bookmarkStart w:id="6" w:name="_Toc232587856"/>
+      <w:bookmarkStart w:id="7" w:name="_Toc232588255"/>
+      <w:bookmarkStart w:id="8" w:name="_Toc232592549"/>
       <w:r>
         <w:rPr>
           <w:rFonts w:ascii="Calibri Light" w:eastAsia="Times New Roman" w:hAnsi="Calibri Light" w:cs="Times New Roman"/>
@@ -1338,8 +1365,9 @@
         <w:lastRenderedPageBreak/>
         <w:t>TOOLS/SOFTWARES USED</w:t>
       </w:r>
-      <w:bookmarkEnd w:id="4"/>
-      <w:bookmarkEnd w:id="5"/>
+      <w:bookmarkEnd w:id="6"/>
+      <w:bookmarkEnd w:id="7"/>
+      <w:bookmarkEnd w:id="8"/>
     </w:p>
     <w:p>
       <w:pPr>
@@ -1408,8 +1436,9 @@
           <w:szCs w:val="26"/>
         </w:rPr>
       </w:pPr>
-      <w:bookmarkStart w:id="6" w:name="_Toc232587857"/>
-      <w:bookmarkStart w:id="7" w:name="_Toc232588256"/>
+      <w:bookmarkStart w:id="9" w:name="_Toc232587857"/>
+      <w:bookmarkStart w:id="10" w:name="_Toc232588256"/>
+      <w:bookmarkStart w:id="11" w:name="_Toc232592550"/>
       <w:r>
         <w:rPr>
           <w:rFonts w:ascii="Calibri Light" w:eastAsia="Times New Roman" w:hAnsi="Calibri Light" w:cs="Times New Roman"/>
@@ -1419,8 +1448,9 @@
         </w:rPr>
         <w:t>PERSONNAL REFLECTION</w:t>
       </w:r>
-      <w:bookmarkEnd w:id="6"/>
-      <w:bookmarkEnd w:id="7"/>
+      <w:bookmarkEnd w:id="9"/>
+      <w:bookmarkEnd w:id="10"/>
+      <w:bookmarkEnd w:id="11"/>
     </w:p>
     <w:p>
       <w:pPr>
@@ -1460,8 +1490,9 @@
           <w:szCs w:val="32"/>
         </w:rPr>
       </w:pPr>
-      <w:bookmarkStart w:id="8" w:name="_Toc232587858"/>
-      <w:bookmarkStart w:id="9" w:name="_Toc232588257"/>
+      <w:bookmarkStart w:id="12" w:name="_Toc232587858"/>
+      <w:bookmarkStart w:id="13" w:name="_Toc232588257"/>
+      <w:bookmarkStart w:id="14" w:name="_Toc232592551"/>
       <w:r>
         <w:rPr>
           <w:rFonts w:ascii="Calibri" w:eastAsia="Times New Roman" w:hAnsi="Calibri" w:cs="Times New Roman"/>
@@ -1489,8 +1520,9 @@
         </w:rPr>
         <w:t>: DATA MANAGEMENT</w:t>
       </w:r>
-      <w:bookmarkEnd w:id="8"/>
-      <w:bookmarkEnd w:id="9"/>
+      <w:bookmarkEnd w:id="12"/>
+      <w:bookmarkEnd w:id="13"/>
+      <w:bookmarkEnd w:id="14"/>
     </w:p>
     <w:p>
       <w:pPr>
@@ -1505,8 +1537,9 @@
           <w:szCs w:val="26"/>
         </w:rPr>
       </w:pPr>
-      <w:bookmarkStart w:id="10" w:name="_Toc232587859"/>
-      <w:bookmarkStart w:id="11" w:name="_Toc232588258"/>
+      <w:bookmarkStart w:id="15" w:name="_Toc232587859"/>
+      <w:bookmarkStart w:id="16" w:name="_Toc232588258"/>
+      <w:bookmarkStart w:id="17" w:name="_Toc232592552"/>
       <w:r>
         <w:rPr>
           <w:rFonts w:ascii="Calibri Light" w:eastAsia="Times New Roman" w:hAnsi="Calibri Light" w:cs="Times New Roman"/>
@@ -1516,8 +1549,9 @@
         </w:rPr>
         <w:t>PRACTICAL EXERCISE DONE</w:t>
       </w:r>
-      <w:bookmarkEnd w:id="10"/>
-      <w:bookmarkEnd w:id="11"/>
+      <w:bookmarkEnd w:id="15"/>
+      <w:bookmarkEnd w:id="16"/>
+      <w:bookmarkEnd w:id="17"/>
     </w:p>
     <w:p>
       <w:pPr>
@@ -1562,7 +1596,7 @@
           <w:szCs w:val="24"/>
         </w:rPr>
         <w:drawing>
-          <wp:inline distT="0" distB="0" distL="0" distR="0" wp14:anchorId="41F47197" wp14:editId="59B67423">
+          <wp:inline distT="0" distB="0" distL="0" distR="0" wp14:anchorId="5067EAD6" wp14:editId="3DA8F8F9">
             <wp:extent cx="5943600" cy="3168650"/>
             <wp:effectExtent l="0" t="0" r="0" b="0"/>
             <wp:docPr id="29" name="Picture 29"/>
@@ -1577,7 +1611,7 @@
                     <pic:cNvPicPr/>
                   </pic:nvPicPr>
                   <pic:blipFill>
-                    <a:blip r:embed="rId6" cstate="print">
+                    <a:blip r:embed="rId8" cstate="print">
                       <a:extLst>
                         <a:ext uri="{28A0092B-C50C-407E-A947-70E740481C1C}">
                           <a14:useLocalDpi xmlns:a14="http://schemas.microsoft.com/office/drawing/2010/main" val="0"/>
@@ -1612,7 +1646,7 @@
         </w:rPr>
         <w:lastRenderedPageBreak/>
         <w:drawing>
-          <wp:inline distT="0" distB="0" distL="0" distR="0" wp14:anchorId="47924B17" wp14:editId="52578C2B">
+          <wp:inline distT="0" distB="0" distL="0" distR="0" wp14:anchorId="16642B25" wp14:editId="1BD7F73F">
             <wp:extent cx="4237990" cy="8229600"/>
             <wp:effectExtent l="0" t="0" r="0" b="0"/>
             <wp:docPr id="30" name="Picture 30"/>
@@ -1627,7 +1661,7 @@
                     <pic:cNvPicPr/>
                   </pic:nvPicPr>
                   <pic:blipFill>
-                    <a:blip r:embed="rId9">
+                    <a:blip r:embed="rId11">
                       <a:extLst>
                         <a:ext uri="{28A0092B-C50C-407E-A947-70E740481C1C}">
                           <a14:useLocalDpi xmlns:a14="http://schemas.microsoft.com/office/drawing/2010/main" val="0"/>
@@ -1662,7 +1696,7 @@
         </w:rPr>
         <w:lastRenderedPageBreak/>
         <w:drawing>
-          <wp:inline distT="0" distB="0" distL="0" distR="0" wp14:anchorId="03A92D29" wp14:editId="0C3621B7">
+          <wp:inline distT="0" distB="0" distL="0" distR="0" wp14:anchorId="4734E655" wp14:editId="5375186E">
             <wp:extent cx="4279265" cy="8229600"/>
             <wp:effectExtent l="0" t="0" r="6985" b="0"/>
             <wp:docPr id="31" name="Picture 31"/>
@@ -1677,7 +1711,7 @@
                     <pic:cNvPicPr/>
                   </pic:nvPicPr>
                   <pic:blipFill>
-                    <a:blip r:embed="rId10">
+                    <a:blip r:embed="rId12">
                       <a:extLst>
                         <a:ext uri="{28A0092B-C50C-407E-A947-70E740481C1C}">
                           <a14:useLocalDpi xmlns:a14="http://schemas.microsoft.com/office/drawing/2010/main" val="0"/>
@@ -1722,7 +1756,7 @@
         </w:rPr>
         <w:lastRenderedPageBreak/>
         <w:drawing>
-          <wp:inline distT="0" distB="0" distL="0" distR="0" wp14:anchorId="13B81637" wp14:editId="18390051">
+          <wp:inline distT="0" distB="0" distL="0" distR="0" wp14:anchorId="4E370DB9" wp14:editId="31166346">
             <wp:extent cx="4221480" cy="8229600"/>
             <wp:effectExtent l="0" t="0" r="7620" b="0"/>
             <wp:docPr id="32" name="Picture 32"/>
@@ -1737,7 +1771,7 @@
                     <pic:cNvPicPr/>
                   </pic:nvPicPr>
                   <pic:blipFill>
-                    <a:blip r:embed="rId7">
+                    <a:blip r:embed="rId9">
                       <a:extLst>
                         <a:ext uri="{28A0092B-C50C-407E-A947-70E740481C1C}">
                           <a14:useLocalDpi xmlns:a14="http://schemas.microsoft.com/office/drawing/2010/main" val="0"/>
@@ -1777,8 +1811,9 @@
           <w:szCs w:val="26"/>
         </w:rPr>
       </w:pPr>
-      <w:bookmarkStart w:id="12" w:name="_Toc232587860"/>
-      <w:bookmarkStart w:id="13" w:name="_Toc232588259"/>
+      <w:bookmarkStart w:id="18" w:name="_Toc232587860"/>
+      <w:bookmarkStart w:id="19" w:name="_Toc232588259"/>
+      <w:bookmarkStart w:id="20" w:name="_Toc232592553"/>
       <w:r>
         <w:rPr>
           <w:rFonts w:ascii="Calibri Light" w:eastAsia="Times New Roman" w:hAnsi="Calibri Light" w:cs="Times New Roman"/>
@@ -1789,8 +1824,9 @@
         <w:lastRenderedPageBreak/>
         <w:t>TOOLS/SOFTWARES USED</w:t>
       </w:r>
-      <w:bookmarkEnd w:id="12"/>
-      <w:bookmarkEnd w:id="13"/>
+      <w:bookmarkEnd w:id="18"/>
+      <w:bookmarkEnd w:id="19"/>
+      <w:bookmarkEnd w:id="20"/>
     </w:p>
     <w:p>
       <w:pPr>
@@ -1859,8 +1895,9 @@
           <w:szCs w:val="26"/>
         </w:rPr>
       </w:pPr>
-      <w:bookmarkStart w:id="14" w:name="_Toc232587861"/>
-      <w:bookmarkStart w:id="15" w:name="_Toc232588260"/>
+      <w:bookmarkStart w:id="21" w:name="_Toc232587861"/>
+      <w:bookmarkStart w:id="22" w:name="_Toc232588260"/>
+      <w:bookmarkStart w:id="23" w:name="_Toc232592554"/>
       <w:r>
         <w:rPr>
           <w:rFonts w:ascii="Calibri Light" w:eastAsia="Times New Roman" w:hAnsi="Calibri Light" w:cs="Times New Roman"/>
@@ -1870,8 +1907,9 @@
         </w:rPr>
         <w:t>PERSONNAL REFLECTION</w:t>
       </w:r>
-      <w:bookmarkEnd w:id="14"/>
-      <w:bookmarkEnd w:id="15"/>
+      <w:bookmarkEnd w:id="21"/>
+      <w:bookmarkEnd w:id="22"/>
+      <w:bookmarkEnd w:id="23"/>
     </w:p>
     <w:p>
       <w:pPr>
@@ -1907,8 +1945,9 @@
           <w:szCs w:val="32"/>
         </w:rPr>
       </w:pPr>
-      <w:bookmarkStart w:id="16" w:name="_Toc232587862"/>
-      <w:bookmarkStart w:id="17" w:name="_Toc232588261"/>
+      <w:bookmarkStart w:id="24" w:name="_Toc232587862"/>
+      <w:bookmarkStart w:id="25" w:name="_Toc232588261"/>
+      <w:bookmarkStart w:id="26" w:name="_Toc232592555"/>
       <w:r>
         <w:rPr>
           <w:rFonts w:ascii="Calibri" w:eastAsia="Times New Roman" w:hAnsi="Calibri" w:cs="Times New Roman"/>
@@ -1949,8 +1988,9 @@
         </w:rPr>
         <w:t xml:space="preserve"> AND API</w:t>
       </w:r>
-      <w:bookmarkEnd w:id="16"/>
-      <w:bookmarkEnd w:id="17"/>
+      <w:bookmarkEnd w:id="24"/>
+      <w:bookmarkEnd w:id="25"/>
+      <w:bookmarkEnd w:id="26"/>
     </w:p>
     <w:p>
       <w:pPr>
@@ -1991,8 +2031,9 @@
           <w:szCs w:val="26"/>
         </w:rPr>
       </w:pPr>
-      <w:bookmarkStart w:id="18" w:name="_Toc232587863"/>
-      <w:bookmarkStart w:id="19" w:name="_Toc232588262"/>
+      <w:bookmarkStart w:id="27" w:name="_Toc232587863"/>
+      <w:bookmarkStart w:id="28" w:name="_Toc232588262"/>
+      <w:bookmarkStart w:id="29" w:name="_Toc232592556"/>
       <w:r>
         <w:rPr>
           <w:rFonts w:ascii="Calibri Light" w:eastAsia="Times New Roman" w:hAnsi="Calibri Light" w:cs="Times New Roman"/>
@@ -2002,8 +2043,9 @@
         </w:rPr>
         <w:t>PRACTICAL ACTIVITIES UNDERTAKEN</w:t>
       </w:r>
-      <w:bookmarkEnd w:id="18"/>
-      <w:bookmarkEnd w:id="19"/>
+      <w:bookmarkEnd w:id="27"/>
+      <w:bookmarkEnd w:id="28"/>
+      <w:bookmarkEnd w:id="29"/>
     </w:p>
     <w:p>
       <w:pPr>
@@ -2026,9 +2068,8 @@
           <w:rFonts w:ascii="Calibri" w:eastAsia="Calibri" w:hAnsi="Calibri" w:cs="Times New Roman"/>
           <w:noProof/>
         </w:rPr>
-        <w:lastRenderedPageBreak/>
         <w:drawing>
-          <wp:inline distT="0" distB="0" distL="0" distR="0" wp14:anchorId="5DCDF013" wp14:editId="40800223">
+          <wp:inline distT="0" distB="0" distL="0" distR="0" wp14:anchorId="42EB51F1" wp14:editId="58B35866">
             <wp:extent cx="5943600" cy="3183890"/>
             <wp:effectExtent l="0" t="0" r="0" b="0"/>
             <wp:docPr id="40" name="Picture 40"/>
@@ -2043,7 +2084,7 @@
                     <pic:cNvPicPr/>
                   </pic:nvPicPr>
                   <pic:blipFill>
-                    <a:blip r:embed="rId11" cstate="print">
+                    <a:blip r:embed="rId13" cstate="print">
                       <a:extLst>
                         <a:ext uri="{28A0092B-C50C-407E-A947-70E740481C1C}">
                           <a14:useLocalDpi xmlns:a14="http://schemas.microsoft.com/office/drawing/2010/main" val="0"/>
@@ -2069,13 +2110,22 @@
           </wp:inline>
         </w:drawing>
       </w:r>
-      <w:r>
+    </w:p>
+    <w:p>
+      <w:pPr>
         <w:rPr>
           <w:rFonts w:ascii="Calibri" w:eastAsia="Calibri" w:hAnsi="Calibri" w:cs="Times New Roman"/>
           <w:noProof/>
         </w:rPr>
+      </w:pPr>
+      <w:r>
+        <w:rPr>
+          <w:rFonts w:ascii="Calibri" w:eastAsia="Calibri" w:hAnsi="Calibri" w:cs="Times New Roman"/>
+          <w:noProof/>
+        </w:rPr>
+        <w:lastRenderedPageBreak/>
         <w:drawing>
-          <wp:inline distT="0" distB="0" distL="0" distR="0" wp14:anchorId="09DECE83" wp14:editId="43A52A3E">
+          <wp:inline distT="0" distB="0" distL="0" distR="0" wp14:anchorId="735336B0" wp14:editId="5A6604E2">
             <wp:extent cx="5943600" cy="3213100"/>
             <wp:effectExtent l="0" t="0" r="0" b="6350"/>
             <wp:docPr id="41" name="Picture 41"/>
@@ -2090,7 +2140,7 @@
                     <pic:cNvPicPr/>
                   </pic:nvPicPr>
                   <pic:blipFill>
-                    <a:blip r:embed="rId12" cstate="print">
+                    <a:blip r:embed="rId14" cstate="print">
                       <a:extLst>
                         <a:ext uri="{28A0092B-C50C-407E-A947-70E740481C1C}">
                           <a14:useLocalDpi xmlns:a14="http://schemas.microsoft.com/office/drawing/2010/main" val="0"/>
@@ -2123,6 +2173,44 @@
           <w:rFonts w:ascii="Calibri" w:eastAsia="Calibri" w:hAnsi="Calibri" w:cs="Times New Roman"/>
         </w:rPr>
       </w:pPr>
+    </w:p>
+    <w:p>
+      <w:pPr>
+        <w:rPr>
+          <w:rFonts w:ascii="Calibri" w:eastAsia="Calibri" w:hAnsi="Calibri" w:cs="Times New Roman"/>
+        </w:rPr>
+      </w:pPr>
+    </w:p>
+    <w:p>
+      <w:pPr>
+        <w:rPr>
+          <w:rFonts w:ascii="Calibri" w:eastAsia="Calibri" w:hAnsi="Calibri" w:cs="Times New Roman"/>
+          <w:noProof/>
+        </w:rPr>
+      </w:pPr>
+    </w:p>
+    <w:p>
+      <w:pPr>
+        <w:tabs>
+          <w:tab w:val="left" w:pos="1575"/>
+        </w:tabs>
+        <w:rPr>
+          <w:rFonts w:ascii="Calibri" w:eastAsia="Calibri" w:hAnsi="Calibri" w:cs="Times New Roman"/>
+        </w:rPr>
+      </w:pPr>
+      <w:r>
+        <w:rPr>
+          <w:rFonts w:ascii="Calibri" w:eastAsia="Calibri" w:hAnsi="Calibri" w:cs="Times New Roman"/>
+        </w:rPr>
+        <w:tab/>
+      </w:r>
+    </w:p>
+    <w:p>
+      <w:pPr>
+        <w:rPr>
+          <w:rFonts w:ascii="Calibri" w:eastAsia="Calibri" w:hAnsi="Calibri" w:cs="Times New Roman"/>
+        </w:rPr>
+      </w:pPr>
       <w:r>
         <w:rPr>
           <w:rFonts w:ascii="Calibri" w:eastAsia="Calibri" w:hAnsi="Calibri" w:cs="Times New Roman"/>
@@ -2130,7 +2218,7 @@
         </w:rPr>
         <w:lastRenderedPageBreak/>
         <w:drawing>
-          <wp:inline distT="0" distB="0" distL="0" distR="0" wp14:anchorId="32525E45" wp14:editId="1CF75D6D">
+          <wp:inline distT="0" distB="0" distL="0" distR="0" wp14:anchorId="16D63130" wp14:editId="3229C52C">
             <wp:extent cx="4283710" cy="8229600"/>
             <wp:effectExtent l="0" t="0" r="2540" b="0"/>
             <wp:docPr id="42" name="Picture 42"/>
@@ -2145,7 +2233,7 @@
                     <pic:cNvPicPr/>
                   </pic:nvPicPr>
                   <pic:blipFill>
-                    <a:blip r:embed="rId13">
+                    <a:blip r:embed="rId15">
                       <a:extLst>
                         <a:ext uri="{28A0092B-C50C-407E-A947-70E740481C1C}">
                           <a14:useLocalDpi xmlns:a14="http://schemas.microsoft.com/office/drawing/2010/main" val="0"/>
@@ -2185,8 +2273,9 @@
           <w:szCs w:val="26"/>
         </w:rPr>
       </w:pPr>
-      <w:bookmarkStart w:id="20" w:name="_Toc232587864"/>
-      <w:bookmarkStart w:id="21" w:name="_Toc232588263"/>
+      <w:bookmarkStart w:id="30" w:name="_Toc232587864"/>
+      <w:bookmarkStart w:id="31" w:name="_Toc232588263"/>
+      <w:bookmarkStart w:id="32" w:name="_Toc232592557"/>
       <w:r>
         <w:rPr>
           <w:rFonts w:ascii="Calibri Light" w:eastAsia="Times New Roman" w:hAnsi="Calibri Light" w:cs="Times New Roman"/>
@@ -2197,8 +2286,9 @@
         <w:lastRenderedPageBreak/>
         <w:t>TOOLS/SOFTWARE USED</w:t>
       </w:r>
-      <w:bookmarkEnd w:id="20"/>
-      <w:bookmarkEnd w:id="21"/>
+      <w:bookmarkEnd w:id="30"/>
+      <w:bookmarkEnd w:id="31"/>
+      <w:bookmarkEnd w:id="32"/>
     </w:p>
     <w:p>
       <w:pPr>
@@ -2267,8 +2357,9 @@
           <w:szCs w:val="26"/>
         </w:rPr>
       </w:pPr>
-      <w:bookmarkStart w:id="22" w:name="_Toc232587865"/>
-      <w:bookmarkStart w:id="23" w:name="_Toc232588264"/>
+      <w:bookmarkStart w:id="33" w:name="_Toc232587865"/>
+      <w:bookmarkStart w:id="34" w:name="_Toc232588264"/>
+      <w:bookmarkStart w:id="35" w:name="_Toc232592558"/>
       <w:r>
         <w:rPr>
           <w:rFonts w:ascii="Calibri Light" w:eastAsia="Times New Roman" w:hAnsi="Calibri Light" w:cs="Times New Roman"/>
@@ -2278,8 +2369,9 @@
         </w:rPr>
         <w:t>PERSONNAL REFLECTION</w:t>
       </w:r>
-      <w:bookmarkEnd w:id="22"/>
-      <w:bookmarkEnd w:id="23"/>
+      <w:bookmarkEnd w:id="33"/>
+      <w:bookmarkEnd w:id="34"/>
+      <w:bookmarkEnd w:id="35"/>
     </w:p>
     <w:p>
       <w:pPr>
@@ -2308,8 +2400,9 @@
           <w:szCs w:val="32"/>
         </w:rPr>
       </w:pPr>
-      <w:bookmarkStart w:id="24" w:name="_Toc232587866"/>
-      <w:bookmarkStart w:id="25" w:name="_Toc232588265"/>
+      <w:bookmarkStart w:id="36" w:name="_Toc232587866"/>
+      <w:bookmarkStart w:id="37" w:name="_Toc232588265"/>
+      <w:bookmarkStart w:id="38" w:name="_Toc232592559"/>
       <w:r>
         <w:rPr>
           <w:rFonts w:ascii="Calibri" w:eastAsia="Times New Roman" w:hAnsi="Calibri" w:cs="Times New Roman"/>
@@ -2320,8 +2413,9 @@
         </w:rPr>
         <w:t>REPORT</w:t>
       </w:r>
-      <w:bookmarkEnd w:id="24"/>
-      <w:bookmarkEnd w:id="25"/>
+      <w:bookmarkEnd w:id="36"/>
+      <w:bookmarkEnd w:id="37"/>
+      <w:bookmarkEnd w:id="38"/>
     </w:p>
     <w:p>
       <w:r>
@@ -2329,6 +2423,7 @@
       </w:r>
     </w:p>
     <w:sectPr>
+      <w:footerReference w:type="default" r:id="rId16"/>
       <w:pgSz w:w="12240" w:h="15840"/>
       <w:pgMar w:top="1440" w:right="1440" w:bottom="1440" w:left="1440" w:header="720" w:footer="720" w:gutter="0"/>
       <w:cols w:space="720"/>
@@ -2336,6 +2431,80 @@
     </w:sectPr>
   </w:body>
 </w:document>
+</file>
+
+<file path=word/endnotes.xml><?xml version="1.0" encoding="utf-8"?>
+<w:endnotes xmlns:wpc="http://schemas.microsoft.com/office/word/2010/wordprocessingCanvas" xmlns:cx="http://schemas.microsoft.com/office/drawing/2014/chartex" xmlns:cx1="http://schemas.microsoft.com/office/drawing/2015/9/8/chartex" xmlns:cx2="http://schemas.microsoft.com/office/drawing/2015/10/21/chartex" xmlns:cx3="http://schemas.microsoft.com/office/drawing/2016/5/9/chartex" xmlns:cx4="http://schemas.microsoft.com/office/drawing/2016/5/10/chartex" xmlns:cx5="http://schemas.microsoft.com/office/drawing/2016/5/11/chartex" xmlns:cx6="http://schemas.microsoft.com/office/drawing/2016/5/12/chartex" xmlns:cx7="http://schemas.microsoft.com/office/drawing/2016/5/13/chartex" xmlns:cx8="http://schemas.microsoft.com/office/drawing/2016/5/14/chartex" xmlns:mc="http://schemas.openxmlformats.org/markup-compatibility/2006" xmlns:aink="http://schemas.microsoft.com/office/drawing/2016/ink" xmlns:am3d="http://schemas.microsoft.com/office/drawing/2017/model3d" xmlns:o="urn:schemas-microsoft-com:office:office" xmlns:r="http://schemas.openxmlformats.org/officeDocument/2006/relationships" xmlns:m="http://schemas.openxmlformats.org/officeDocument/2006/math" xmlns:v="urn:schemas-microsoft-com:vml" xmlns:wp14="http://schemas.microsoft.com/office/word/2010/wordprocessingDrawing" xmlns:wp="http://schemas.openxmlformats.org/drawingml/2006/wordprocessingDrawing" xmlns:w10="urn:schemas-microsoft-com:office:word" xmlns:w="http://schemas.openxmlformats.org/wordprocessingml/2006/main" xmlns:w14="http://schemas.microsoft.com/office/word/2010/wordml" xmlns:w15="http://schemas.microsoft.com/office/word/2012/wordml" xmlns:w16cex="http://schemas.microsoft.com/office/word/2018/wordml/cex" xmlns:w16cid="http://schemas.microsoft.com/office/word/2016/wordml/cid" xmlns:w16="http://schemas.microsoft.com/office/word/2018/wordml" xmlns:w16sdtdh="http://schemas.microsoft.com/office/word/2020/wordml/sdtdatahash" xmlns:w16se="http://schemas.microsoft.com/office/word/2015/wordml/symex" xmlns:wpg="http://schemas.microsoft.com/office/word/2010/wordprocessingGroup" xmlns:wpi="http://schemas.microsoft.com/office/word/2010/wordprocessingInk" xmlns:wne="http://schemas.microsoft.com/office/word/2006/wordml" xmlns:wps="http://schemas.microsoft.com/office/word/2010/wordprocessingShape" mc:Ignorable="w14 w15 w16se w16cid w16 w16cex w16sdtdh wp14">
+  <w:endnote w:type="separator" w:id="-1">
+    <w:p>
+      <w:pPr>
+        <w:spacing w:after="0" w:line="240" w:lineRule="auto"/>
+      </w:pPr>
+      <w:r>
+        <w:separator/>
+      </w:r>
+    </w:p>
+  </w:endnote>
+  <w:endnote w:type="continuationSeparator" w:id="0">
+    <w:p>
+      <w:pPr>
+        <w:spacing w:after="0" w:line="240" w:lineRule="auto"/>
+      </w:pPr>
+      <w:r>
+        <w:continuationSeparator/>
+      </w:r>
+    </w:p>
+  </w:endnote>
+</w:endnotes>
+</file>
+
+<file path=word/footer1.xml><?xml version="1.0" encoding="utf-8"?>
+<w:ftr xmlns:wpc="http://schemas.microsoft.com/office/word/2010/wordprocessingCanvas" xmlns:cx="http://schemas.microsoft.com/office/drawing/2014/chartex" xmlns:cx1="http://schemas.microsoft.com/office/drawing/2015/9/8/chartex" xmlns:cx2="http://schemas.microsoft.com/office/drawing/2015/10/21/chartex" xmlns:cx3="http://schemas.microsoft.com/office/drawing/2016/5/9/chartex" xmlns:cx4="http://schemas.microsoft.com/office/drawing/2016/5/10/chartex" xmlns:cx5="http://schemas.microsoft.com/office/drawing/2016/5/11/chartex" xmlns:cx6="http://schemas.microsoft.com/office/drawing/2016/5/12/chartex" xmlns:cx7="http://schemas.microsoft.com/office/drawing/2016/5/13/chartex" xmlns:cx8="http://schemas.microsoft.com/office/drawing/2016/5/14/chartex" xmlns:mc="http://schemas.openxmlformats.org/markup-compatibility/2006" xmlns:aink="http://schemas.microsoft.com/office/drawing/2016/ink" xmlns:am3d="http://schemas.microsoft.com/office/drawing/2017/model3d" xmlns:o="urn:schemas-microsoft-com:office:office" xmlns:r="http://schemas.openxmlformats.org/officeDocument/2006/relationships" xmlns:m="http://schemas.openxmlformats.org/officeDocument/2006/math" xmlns:v="urn:schemas-microsoft-com:vml" xmlns:wp14="http://schemas.microsoft.com/office/word/2010/wordprocessingDrawing" xmlns:wp="http://schemas.openxmlformats.org/drawingml/2006/wordprocessingDrawing" xmlns:w10="urn:schemas-microsoft-com:office:word" xmlns:w="http://schemas.openxmlformats.org/wordprocessingml/2006/main" xmlns:w14="http://schemas.microsoft.com/office/word/2010/wordml" xmlns:w15="http://schemas.microsoft.com/office/word/2012/wordml" xmlns:w16cex="http://schemas.microsoft.com/office/word/2018/wordml/cex" xmlns:w16cid="http://schemas.microsoft.com/office/word/2016/wordml/cid" xmlns:w16="http://schemas.microsoft.com/office/word/2018/wordml" xmlns:w16sdtdh="http://schemas.microsoft.com/office/word/2020/wordml/sdtdatahash" xmlns:w16se="http://schemas.microsoft.com/office/word/2015/wordml/symex" xmlns:wpg="http://schemas.microsoft.com/office/word/2010/wordprocessingGroup" xmlns:wpi="http://schemas.microsoft.com/office/word/2010/wordprocessingInk" xmlns:wne="http://schemas.microsoft.com/office/word/2006/wordml" xmlns:wps="http://schemas.microsoft.com/office/word/2010/wordprocessingShape" mc:Ignorable="w14 w15 w16se w16cid w16 w16cex w16sdtdh wp14">
+  <w:p>
+    <w:pPr>
+      <w:pStyle w:val="Footer"/>
+    </w:pPr>
+    <w:r>
+      <w:t>BIT</w:t>
+    </w:r>
+    <w:r>
+      <w:t>202461467</w:t>
+    </w:r>
+    <w:r>
+      <w:t xml:space="preserve"> | ABIGAEL MUTHAMA MUTANU</w:t>
+    </w:r>
+  </w:p>
+  <w:p>
+    <w:pPr>
+      <w:pStyle w:val="Footer"/>
+    </w:pPr>
+  </w:p>
+</w:ftr>
+</file>
+
+<file path=word/footnotes.xml><?xml version="1.0" encoding="utf-8"?>
+<w:footnotes xmlns:wpc="http://schemas.microsoft.com/office/word/2010/wordprocessingCanvas" xmlns:cx="http://schemas.microsoft.com/office/drawing/2014/chartex" xmlns:cx1="http://schemas.microsoft.com/office/drawing/2015/9/8/chartex" xmlns:cx2="http://schemas.microsoft.com/office/drawing/2015/10/21/chartex" xmlns:cx3="http://schemas.microsoft.com/office/drawing/2016/5/9/chartex" xmlns:cx4="http://schemas.microsoft.com/office/drawing/2016/5/10/chartex" xmlns:cx5="http://schemas.microsoft.com/office/drawing/2016/5/11/chartex" xmlns:cx6="http://schemas.microsoft.com/office/drawing/2016/5/12/chartex" xmlns:cx7="http://schemas.microsoft.com/office/drawing/2016/5/13/chartex" xmlns:cx8="http://schemas.microsoft.com/office/drawing/2016/5/14/chartex" xmlns:mc="http://schemas.openxmlformats.org/markup-compatibility/2006" xmlns:aink="http://schemas.microsoft.com/office/drawing/2016/ink" xmlns:am3d="http://schemas.microsoft.com/office/drawing/2017/model3d" xmlns:o="urn:schemas-microsoft-com:office:office" xmlns:r="http://schemas.openxmlformats.org/officeDocument/2006/relationships" xmlns:m="http://schemas.openxmlformats.org/officeDocument/2006/math" xmlns:v="urn:schemas-microsoft-com:vml" xmlns:wp14="http://schemas.microsoft.com/office/word/2010/wordprocessingDrawing" xmlns:wp="http://schemas.openxmlformats.org/drawingml/2006/wordprocessingDrawing" xmlns:w10="urn:schemas-microsoft-com:office:word" xmlns:w="http://schemas.openxmlformats.org/wordprocessingml/2006/main" xmlns:w14="http://schemas.microsoft.com/office/word/2010/wordml" xmlns:w15="http://schemas.microsoft.com/office/word/2012/wordml" xmlns:w16cex="http://schemas.microsoft.com/office/word/2018/wordml/cex" xmlns:w16cid="http://schemas.microsoft.com/office/word/2016/wordml/cid" xmlns:w16="http://schemas.microsoft.com/office/word/2018/wordml" xmlns:w16sdtdh="http://schemas.microsoft.com/office/word/2020/wordml/sdtdatahash" xmlns:w16se="http://schemas.microsoft.com/office/word/2015/wordml/symex" xmlns:wpg="http://schemas.microsoft.com/office/word/2010/wordprocessingGroup" xmlns:wpi="http://schemas.microsoft.com/office/word/2010/wordprocessingInk" xmlns:wne="http://schemas.microsoft.com/office/word/2006/wordml" xmlns:wps="http://schemas.microsoft.com/office/word/2010/wordprocessingShape" mc:Ignorable="w14 w15 w16se w16cid w16 w16cex w16sdtdh wp14">
+  <w:footnote w:type="separator" w:id="-1">
+    <w:p>
+      <w:pPr>
+        <w:spacing w:after="0" w:line="240" w:lineRule="auto"/>
+      </w:pPr>
+      <w:r>
+        <w:separator/>
+      </w:r>
+    </w:p>
+  </w:footnote>
+  <w:footnote w:type="continuationSeparator" w:id="0">
+    <w:p>
+      <w:pPr>
+        <w:spacing w:after="0" w:line="240" w:lineRule="auto"/>
+      </w:pPr>
+      <w:r>
+        <w:continuationSeparator/>
+      </w:r>
+    </w:p>
+  </w:footnote>
+</w:footnotes>
 </file>
 
 <file path=word/numbering.xml><?xml version="1.0" encoding="utf-8"?>
@@ -3423,6 +3592,52 @@
       <w:szCs w:val="26"/>
     </w:rPr>
   </w:style>
+  <w:style w:type="paragraph" w:styleId="Heading3">
+    <w:name w:val="heading 3"/>
+    <w:basedOn w:val="Normal"/>
+    <w:next w:val="Normal"/>
+    <w:link w:val="Heading3Char"/>
+    <w:uiPriority w:val="9"/>
+    <w:semiHidden/>
+    <w:unhideWhenUsed/>
+    <w:qFormat/>
+    <w:rsid w:val="002D6320"/>
+    <w:pPr>
+      <w:keepNext/>
+      <w:keepLines/>
+      <w:spacing w:before="40" w:after="0"/>
+      <w:outlineLvl w:val="2"/>
+    </w:pPr>
+    <w:rPr>
+      <w:rFonts w:asciiTheme="majorHAnsi" w:eastAsiaTheme="majorEastAsia" w:hAnsiTheme="majorHAnsi" w:cstheme="majorBidi"/>
+      <w:color w:val="1F3763" w:themeColor="accent1" w:themeShade="7F"/>
+      <w:sz w:val="24"/>
+      <w:szCs w:val="24"/>
+    </w:rPr>
+  </w:style>
+  <w:style w:type="paragraph" w:styleId="Heading4">
+    <w:name w:val="heading 4"/>
+    <w:basedOn w:val="Normal"/>
+    <w:next w:val="Normal"/>
+    <w:link w:val="Heading4Char"/>
+    <w:uiPriority w:val="9"/>
+    <w:semiHidden/>
+    <w:unhideWhenUsed/>
+    <w:qFormat/>
+    <w:rsid w:val="002D6320"/>
+    <w:pPr>
+      <w:keepNext/>
+      <w:keepLines/>
+      <w:spacing w:before="40" w:after="0"/>
+      <w:outlineLvl w:val="3"/>
+    </w:pPr>
+    <w:rPr>
+      <w:rFonts w:asciiTheme="majorHAnsi" w:eastAsiaTheme="majorEastAsia" w:hAnsiTheme="majorHAnsi" w:cstheme="majorBidi"/>
+      <w:i/>
+      <w:iCs/>
+      <w:color w:val="2F5496" w:themeColor="accent1" w:themeShade="BF"/>
+    </w:rPr>
+  </w:style>
   <w:style w:type="character" w:default="1" w:styleId="DefaultParagraphFont">
     <w:name w:val="Default Paragraph Font"/>
     <w:uiPriority w:val="1"/>
@@ -3670,6 +3885,102 @@
       <w:color w:val="0563C1" w:themeColor="hyperlink"/>
       <w:u w:val="single"/>
     </w:rPr>
+  </w:style>
+  <w:style w:type="character" w:customStyle="1" w:styleId="Heading4Char">
+    <w:name w:val="Heading 4 Char"/>
+    <w:basedOn w:val="DefaultParagraphFont"/>
+    <w:link w:val="Heading4"/>
+    <w:uiPriority w:val="9"/>
+    <w:semiHidden/>
+    <w:rsid w:val="002D6320"/>
+    <w:rPr>
+      <w:rFonts w:asciiTheme="majorHAnsi" w:eastAsiaTheme="majorEastAsia" w:hAnsiTheme="majorHAnsi" w:cstheme="majorBidi"/>
+      <w:i/>
+      <w:iCs/>
+      <w:color w:val="2F5496" w:themeColor="accent1" w:themeShade="BF"/>
+    </w:rPr>
+  </w:style>
+  <w:style w:type="character" w:customStyle="1" w:styleId="Heading3Char">
+    <w:name w:val="Heading 3 Char"/>
+    <w:basedOn w:val="DefaultParagraphFont"/>
+    <w:link w:val="Heading3"/>
+    <w:uiPriority w:val="9"/>
+    <w:rsid w:val="002D6320"/>
+    <w:rPr>
+      <w:rFonts w:asciiTheme="majorHAnsi" w:eastAsiaTheme="majorEastAsia" w:hAnsiTheme="majorHAnsi" w:cstheme="majorBidi"/>
+      <w:color w:val="1F3763" w:themeColor="accent1" w:themeShade="7F"/>
+      <w:sz w:val="24"/>
+      <w:szCs w:val="24"/>
+    </w:rPr>
+  </w:style>
+  <w:style w:type="paragraph" w:styleId="NoSpacing">
+    <w:name w:val="No Spacing"/>
+    <w:uiPriority w:val="1"/>
+    <w:qFormat/>
+    <w:rsid w:val="002D6320"/>
+    <w:pPr>
+      <w:spacing w:after="0" w:line="240" w:lineRule="auto"/>
+    </w:pPr>
+    <w:rPr>
+      <w:rFonts w:ascii="Cambria" w:eastAsia="MS Mincho" w:hAnsi="Cambria" w:cs="SimSun"/>
+    </w:rPr>
+  </w:style>
+  <w:style w:type="paragraph" w:styleId="TOC3">
+    <w:name w:val="toc 3"/>
+    <w:basedOn w:val="Normal"/>
+    <w:next w:val="Normal"/>
+    <w:autoRedefine/>
+    <w:uiPriority w:val="39"/>
+    <w:unhideWhenUsed/>
+    <w:rsid w:val="00B11CA9"/>
+    <w:pPr>
+      <w:spacing w:after="100"/>
+      <w:ind w:left="440"/>
+    </w:pPr>
+  </w:style>
+  <w:style w:type="paragraph" w:styleId="Header">
+    <w:name w:val="header"/>
+    <w:basedOn w:val="Normal"/>
+    <w:link w:val="HeaderChar"/>
+    <w:uiPriority w:val="99"/>
+    <w:unhideWhenUsed/>
+    <w:rsid w:val="003857AD"/>
+    <w:pPr>
+      <w:tabs>
+        <w:tab w:val="center" w:pos="4680"/>
+        <w:tab w:val="right" w:pos="9360"/>
+      </w:tabs>
+      <w:spacing w:after="0" w:line="240" w:lineRule="auto"/>
+    </w:pPr>
+  </w:style>
+  <w:style w:type="character" w:customStyle="1" w:styleId="HeaderChar">
+    <w:name w:val="Header Char"/>
+    <w:basedOn w:val="DefaultParagraphFont"/>
+    <w:link w:val="Header"/>
+    <w:uiPriority w:val="99"/>
+    <w:rsid w:val="003857AD"/>
+  </w:style>
+  <w:style w:type="paragraph" w:styleId="Footer">
+    <w:name w:val="footer"/>
+    <w:basedOn w:val="Normal"/>
+    <w:link w:val="FooterChar"/>
+    <w:uiPriority w:val="99"/>
+    <w:unhideWhenUsed/>
+    <w:rsid w:val="003857AD"/>
+    <w:pPr>
+      <w:tabs>
+        <w:tab w:val="center" w:pos="4680"/>
+        <w:tab w:val="right" w:pos="9360"/>
+      </w:tabs>
+      <w:spacing w:after="0" w:line="240" w:lineRule="auto"/>
+    </w:pPr>
+  </w:style>
+  <w:style w:type="character" w:customStyle="1" w:styleId="FooterChar">
+    <w:name w:val="Footer Char"/>
+    <w:basedOn w:val="DefaultParagraphFont"/>
+    <w:link w:val="Footer"/>
+    <w:uiPriority w:val="99"/>
+    <w:rsid w:val="003857AD"/>
   </w:style>
 </w:styles>
 </file>

</xml_diff>